<commit_message>
docs: retain full acquisition design and add single-satellite experiment
</commit_message>
<xml_diff>
--- a/deliverables/模块实验报告/01_捕获模块设计报告.docx
+++ b/deliverables/模块实验报告/01_捕获模块设计报告.docx
@@ -29,7 +29,7 @@
           <w:color w:val="000000"/>
           <w:sz w:val="21"/>
         </w:rPr>
-        <w:t>项目组实验报告　2026 年 10 月 13 日　版本 2.1</w:t>
+        <w:t>项目组实验报告　2026 年 10 月 19 日　版本 2.2</w:t>
       </w:r>
     </w:p>
     <w:p>
@@ -44,7 +44,7 @@
           <w:color w:val="000000"/>
           <w:sz w:val="24"/>
         </w:rPr>
-        <w:t>摘要　设计实现了 64 路码相位并行相关、粗细多普勒搜索及带时间外推的捕获移交。合成 RTL 用例成功检出 PRN 10，拒判缺席 PRN 6，并在移交后进入闭环锁定；公开数据的独立软件参考从 63 个 PRN 中检出六颗卫星。报告分别给出实现方案、实验条件、仿真结果及其验证范围。</w:t>
+        <w:t>摘要　完整接收机采用 64 路码相位并行相关、粗细多普勒搜索和带时间外推的捕获移交，原 RTL 及六星软件参考结果继续保留。新增教师单星实验逐次搜索码起始位置，在第 11 轮捕获位置 10，对齐能量为最大未对齐能量的 961 倍。报告给出两种方案的设计、实验结果和验证范围。</w:t>
       </w:r>
     </w:p>
     <w:p>
@@ -502,7 +502,7 @@
           <w:color w:val="000000"/>
           <w:sz w:val="19"/>
         </w:rPr>
-        <w:t>本报告以 RTL 版本 2556e76 为实现基线。2026 年 10 月 13 日 ModelSim SE-64 10.5 回归 20／20 通过；既有图表与软件参考保留原实验来源。新版输入契约和独立联调证据见附录，原始日志版本标记保持不变。</w:t>
+        <w:t>原完整工程历史结果对应 2556e76，20 项 RTL 回归于 2026 年 10 月 13 日通过。第 10 节单星实验对应 7fbbd52。历史曲线、六星软件结果和新增实验分别注明来源及范围。</w:t>
       </w:r>
     </w:p>
     <w:p>
@@ -591,6 +591,15 @@
           <w:sz w:val="24"/>
         </w:rPr>
         <w:t>acquisition.sv 由采样缓存、载波下变频、码延迟抽头、并行相关器、粗细搜索控制及移交 NCO 构成。默认设置为 64 路并行相关与 33 024 样本回放缓冲。每一频点分 64 轮回放；各路相邻假设相差半个码片，即 4 个原始样本。硬件按 4096 个槽位组织扫描，覆盖一个码周期的 4092 个半码片位置，末端 4 个槽位按周期回绕。</w:t>
+      </w:r>
+      <w:r>
+        <w:rPr>
+          <w:rFonts w:ascii="Times New Roman" w:hAnsi="Times New Roman" w:eastAsia="宋体"/>
+          <w:b w:val="0"/>
+          <w:color w:val="000000"/>
+          <w:sz w:val="24"/>
+        </w:rPr>
+        <w:t>当前回放缓存按 3 位有符号数原样保存样本，既保留原 IF2 的四电平输入，也能正确回放简化信号源中的零值。</w:t>
       </w:r>
     </w:p>
     <w:p>
@@ -2030,7 +2039,7 @@
           <w:color w:val="000000"/>
           <w:sz w:val="24"/>
         </w:rPr>
-        <w:t>本次 20 项 RTL 回归全部通过，其中 tb_prn_code_gen、tb_auto_scan、tb_channel_manager 和 tb_acq_input_pause 分别检查码发生、遍历与通道分配、生命周期及输入暂停。上述结果表明对应功能在所列激励下成立；不存在信号的单次拒判不能替代虚警率测量。</w:t>
+        <w:t>2026 年 10 月 13 日的 20 项 RTL 回归全部通过，其中 tb_prn_code_gen、tb_auto_scan、tb_channel_manager 和 tb_acq_input_pause 分别检查码发生、遍历与通道分配、生命周期及输入暂停。上述结果表明对应功能在所列激励下成立；不存在信号的单次拒判不能替代虚警率测量。</w:t>
       </w:r>
     </w:p>
     <w:p>
@@ -3705,6 +3714,3114 @@
         <w:pageBreakBefore/>
       </w:pPr>
       <w:r>
+        <w:t>10 单星捕获设计与仿真验证</w:t>
+      </w:r>
+    </w:p>
+    <w:p>
+      <w:pPr>
+        <w:pStyle w:val="21"/>
+      </w:pPr>
+      <w:r>
+        <w:t>10.1 实验目标与信号条件</w:t>
+      </w:r>
+    </w:p>
+    <w:p>
+      <w:pPr>
+        <w:spacing w:after="80" w:line="360" w:lineRule="exact"/>
+        <w:ind w:firstLine="482"/>
+        <w:jc w:val="both"/>
+      </w:pPr>
+      <w:r>
+        <w:rPr>
+          <w:rFonts w:ascii="Times New Roman" w:hAnsi="Times New Roman" w:eastAsia="宋体"/>
+          <w:b w:val="0"/>
+          <w:color w:val="000000"/>
+          <w:sz w:val="24"/>
+        </w:rPr>
+        <w:t>原完整接收机继续采用 acquisition.sv 完成并行码相位及多普勒搜索，并保留捕获移交、跟踪和电文解调链路。新增 bdi_sliding_correlator.sv 以固定卫星编号和已知中频逐次搜索码起始位置，便于在波形中观察从未对齐到对齐的过程。两种实现共用 prn_code_gen.sv；单星演示作为独立验证入口保留在同一工程中。</w:t>
+      </w:r>
+    </w:p>
+    <w:tbl>
+      <w:tblPr>
+        <w:tblW w:type="auto" w:w="0"/>
+        <w:jc w:val="center"/>
+        <w:tblLayout w:type="fixed"/>
+        <w:tblLook w:firstColumn="1" w:firstRow="1" w:lastColumn="0" w:lastRow="0" w:noHBand="0" w:noVBand="1" w:val="04A0"/>
+        <w:tblBorders>
+          <w:top w:val="single" w:sz="4" w:color="D9D9D9"/>
+          <w:left w:val="single" w:sz="4" w:color="D9D9D9"/>
+          <w:bottom w:val="single" w:sz="4" w:color="D9D9D9"/>
+          <w:right w:val="single" w:sz="4" w:color="D9D9D9"/>
+          <w:insideH w:val="single" w:sz="4" w:color="D9D9D9"/>
+          <w:insideV w:val="single" w:sz="4" w:color="D9D9D9"/>
+        </w:tblBorders>
+        <w:tblCellMar>
+          <w:top w:w="75" w:type="dxa"/>
+          <w:bottom w:w="75" w:type="dxa"/>
+          <w:left w:w="100" w:type="dxa"/>
+          <w:right w:w="100" w:type="dxa"/>
+        </w:tblCellMar>
+      </w:tblPr>
+      <w:tblGrid>
+        <w:gridCol w:w="1984"/>
+        <w:gridCol w:w="7087"/>
+      </w:tblGrid>
+      <w:tr>
+        <w:trPr>
+          <w:cantSplit/>
+          <w:tblHeader/>
+        </w:trPr>
+        <w:tc>
+          <w:tcPr>
+            <w:tcW w:type="dxa" w:w="1984"/>
+            <w:vAlign w:val="center"/>
+            <w:shd w:fill="F2F2F2"/>
+          </w:tcPr>
+          <w:p>
+            <w:pPr>
+              <w:spacing w:after="0" w:line="280" w:lineRule="exact"/>
+              <w:ind w:firstLine="0"/>
+              <w:jc w:val="center"/>
+            </w:pPr>
+            <w:r>
+              <w:rPr>
+                <w:rFonts w:ascii="Times New Roman" w:hAnsi="Times New Roman" w:eastAsia="宋体"/>
+                <w:b/>
+                <w:color w:val="000000"/>
+                <w:sz w:val="21"/>
+              </w:rPr>
+              <w:t>参数</w:t>
+            </w:r>
+          </w:p>
+        </w:tc>
+        <w:tc>
+          <w:tcPr>
+            <w:tcW w:type="dxa" w:w="7087"/>
+            <w:vAlign w:val="center"/>
+            <w:shd w:fill="F2F2F2"/>
+          </w:tcPr>
+          <w:p>
+            <w:pPr>
+              <w:spacing w:after="0" w:line="280" w:lineRule="exact"/>
+              <w:ind w:firstLine="0"/>
+              <w:jc w:val="center"/>
+            </w:pPr>
+            <w:r>
+              <w:rPr>
+                <w:rFonts w:ascii="Times New Roman" w:hAnsi="Times New Roman" w:eastAsia="宋体"/>
+                <w:b/>
+                <w:color w:val="000000"/>
+                <w:sz w:val="21"/>
+              </w:rPr>
+              <w:t>单星实验设置</w:t>
+            </w:r>
+          </w:p>
+        </w:tc>
+      </w:tr>
+      <w:tr>
+        <w:trPr>
+          <w:cantSplit/>
+        </w:trPr>
+        <w:tc>
+          <w:tcPr>
+            <w:tcW w:type="dxa" w:w="1984"/>
+            <w:vAlign w:val="center"/>
+          </w:tcPr>
+          <w:p>
+            <w:pPr>
+              <w:spacing w:after="0" w:line="280" w:lineRule="exact"/>
+              <w:ind w:firstLine="0"/>
+              <w:jc w:val="left"/>
+            </w:pPr>
+            <w:r>
+              <w:rPr>
+                <w:rFonts w:ascii="Times New Roman" w:hAnsi="Times New Roman" w:eastAsia="宋体"/>
+                <w:b w:val="0"/>
+                <w:color w:val="000000"/>
+                <w:sz w:val="21"/>
+              </w:rPr>
+              <w:t>教师激励</w:t>
+            </w:r>
+          </w:p>
+        </w:tc>
+        <w:tc>
+          <w:tcPr>
+            <w:tcW w:type="dxa" w:w="7087"/>
+            <w:vAlign w:val="center"/>
+          </w:tcPr>
+          <w:p>
+            <w:pPr>
+              <w:spacing w:after="0" w:line="280" w:lineRule="exact"/>
+              <w:ind w:firstLine="0"/>
+              <w:jc w:val="left"/>
+            </w:pPr>
+            <w:r>
+              <w:rPr>
+                <w:rFonts w:ascii="Times New Roman" w:hAnsi="Times New Roman" w:eastAsia="宋体"/>
+                <w:b w:val="0"/>
+                <w:color w:val="000000"/>
+                <w:sz w:val="21"/>
+              </w:rPr>
+              <w:t>简化BDI信号模拟源及捕获成功判断标准/bdi_signal_source.sv</w:t>
+            </w:r>
+          </w:p>
+        </w:tc>
+      </w:tr>
+      <w:tr>
+        <w:trPr>
+          <w:cantSplit/>
+        </w:trPr>
+        <w:tc>
+          <w:tcPr>
+            <w:tcW w:type="dxa" w:w="1984"/>
+            <w:vAlign w:val="center"/>
+          </w:tcPr>
+          <w:p>
+            <w:pPr>
+              <w:spacing w:after="0" w:line="280" w:lineRule="exact"/>
+              <w:ind w:firstLine="0"/>
+              <w:jc w:val="left"/>
+            </w:pPr>
+            <w:r>
+              <w:rPr>
+                <w:rFonts w:ascii="Times New Roman" w:hAnsi="Times New Roman" w:eastAsia="宋体"/>
+                <w:b w:val="0"/>
+                <w:color w:val="000000"/>
+                <w:sz w:val="21"/>
+              </w:rPr>
+              <w:t>卫星与起始码位置</w:t>
+            </w:r>
+          </w:p>
+        </w:tc>
+        <w:tc>
+          <w:tcPr>
+            <w:tcW w:type="dxa" w:w="7087"/>
+            <w:vAlign w:val="center"/>
+          </w:tcPr>
+          <w:p>
+            <w:pPr>
+              <w:spacing w:after="0" w:line="280" w:lineRule="exact"/>
+              <w:ind w:firstLine="0"/>
+              <w:jc w:val="left"/>
+            </w:pPr>
+            <w:r>
+              <w:rPr>
+                <w:rFonts w:ascii="Times New Roman" w:hAnsi="Times New Roman" w:eastAsia="宋体"/>
+                <w:b w:val="0"/>
+                <w:color w:val="000000"/>
+                <w:sz w:val="21"/>
+              </w:rPr>
+              <w:t>PRN 6；信号源起始位置 10，从 0 编号</w:t>
+            </w:r>
+          </w:p>
+        </w:tc>
+      </w:tr>
+      <w:tr>
+        <w:trPr>
+          <w:cantSplit/>
+        </w:trPr>
+        <w:tc>
+          <w:tcPr>
+            <w:tcW w:type="dxa" w:w="1984"/>
+            <w:vAlign w:val="center"/>
+          </w:tcPr>
+          <w:p>
+            <w:pPr>
+              <w:spacing w:after="0" w:line="280" w:lineRule="exact"/>
+              <w:ind w:firstLine="0"/>
+              <w:jc w:val="left"/>
+            </w:pPr>
+            <w:r>
+              <w:rPr>
+                <w:rFonts w:ascii="Times New Roman" w:hAnsi="Times New Roman" w:eastAsia="宋体"/>
+                <w:b w:val="0"/>
+                <w:color w:val="000000"/>
+                <w:sz w:val="21"/>
+              </w:rPr>
+              <w:t>采样率与中频</w:t>
+            </w:r>
+          </w:p>
+        </w:tc>
+        <w:tc>
+          <w:tcPr>
+            <w:tcW w:type="dxa" w:w="7087"/>
+            <w:vAlign w:val="center"/>
+          </w:tcPr>
+          <w:p>
+            <w:pPr>
+              <w:spacing w:after="0" w:line="280" w:lineRule="exact"/>
+              <w:ind w:firstLine="0"/>
+              <w:jc w:val="left"/>
+            </w:pPr>
+            <w:r>
+              <w:rPr>
+                <w:rFonts w:ascii="Times New Roman" w:hAnsi="Times New Roman" w:eastAsia="宋体"/>
+                <w:b w:val="0"/>
+                <w:color w:val="000000"/>
+                <w:sz w:val="21"/>
+              </w:rPr>
+              <w:t>16.368 MHz；4.092 MHz；多普勒为 0</w:t>
+            </w:r>
+          </w:p>
+        </w:tc>
+      </w:tr>
+      <w:tr>
+        <w:trPr>
+          <w:cantSplit/>
+        </w:trPr>
+        <w:tc>
+          <w:tcPr>
+            <w:tcW w:type="dxa" w:w="1984"/>
+            <w:vAlign w:val="center"/>
+          </w:tcPr>
+          <w:p>
+            <w:pPr>
+              <w:spacing w:after="0" w:line="280" w:lineRule="exact"/>
+              <w:ind w:firstLine="0"/>
+              <w:jc w:val="left"/>
+            </w:pPr>
+            <w:r>
+              <w:rPr>
+                <w:rFonts w:ascii="Times New Roman" w:hAnsi="Times New Roman" w:eastAsia="宋体"/>
+                <w:b w:val="0"/>
+                <w:color w:val="000000"/>
+                <w:sz w:val="21"/>
+              </w:rPr>
+              <w:t>输入表示</w:t>
+            </w:r>
+          </w:p>
+        </w:tc>
+        <w:tc>
+          <w:tcPr>
+            <w:tcW w:type="dxa" w:w="7087"/>
+            <w:vAlign w:val="center"/>
+          </w:tcPr>
+          <w:p>
+            <w:pPr>
+              <w:spacing w:after="0" w:line="280" w:lineRule="exact"/>
+              <w:ind w:firstLine="0"/>
+              <w:jc w:val="left"/>
+            </w:pPr>
+            <w:r>
+              <w:rPr>
+                <w:rFonts w:ascii="Times New Roman" w:hAnsi="Times New Roman" w:eastAsia="宋体"/>
+                <w:b w:val="0"/>
+                <w:color w:val="000000"/>
+                <w:sz w:val="21"/>
+              </w:rPr>
+              <w:t>有符号二进制补码：01 为 +1，00 为 0，11 为 −1</w:t>
+            </w:r>
+          </w:p>
+        </w:tc>
+      </w:tr>
+      <w:tr>
+        <w:trPr>
+          <w:cantSplit/>
+        </w:trPr>
+        <w:tc>
+          <w:tcPr>
+            <w:tcW w:type="dxa" w:w="1984"/>
+            <w:vAlign w:val="center"/>
+          </w:tcPr>
+          <w:p>
+            <w:pPr>
+              <w:spacing w:after="0" w:line="280" w:lineRule="exact"/>
+              <w:ind w:firstLine="0"/>
+              <w:jc w:val="left"/>
+            </w:pPr>
+            <w:r>
+              <w:rPr>
+                <w:rFonts w:ascii="Times New Roman" w:hAnsi="Times New Roman" w:eastAsia="宋体"/>
+                <w:b w:val="0"/>
+                <w:color w:val="000000"/>
+                <w:sz w:val="21"/>
+              </w:rPr>
+              <w:t>码周期与每轮长度</w:t>
+            </w:r>
+          </w:p>
+        </w:tc>
+        <w:tc>
+          <w:tcPr>
+            <w:tcW w:type="dxa" w:w="7087"/>
+            <w:vAlign w:val="center"/>
+          </w:tcPr>
+          <w:p>
+            <w:pPr>
+              <w:spacing w:after="0" w:line="280" w:lineRule="exact"/>
+              <w:ind w:firstLine="0"/>
+              <w:jc w:val="left"/>
+            </w:pPr>
+            <w:r>
+              <w:rPr>
+                <w:rFonts w:ascii="Times New Roman" w:hAnsi="Times New Roman" w:eastAsia="宋体"/>
+                <w:b w:val="0"/>
+                <w:color w:val="000000"/>
+                <w:sz w:val="21"/>
+              </w:rPr>
+              <w:t>2046 个码片；每码片 8 个样本；每轮 16368 样本，约 1 ms</w:t>
+            </w:r>
+          </w:p>
+        </w:tc>
+      </w:tr>
+      <w:tr>
+        <w:trPr>
+          <w:cantSplit/>
+        </w:trPr>
+        <w:tc>
+          <w:tcPr>
+            <w:tcW w:type="dxa" w:w="1984"/>
+            <w:vAlign w:val="center"/>
+          </w:tcPr>
+          <w:p>
+            <w:pPr>
+              <w:spacing w:after="0" w:line="280" w:lineRule="exact"/>
+              <w:ind w:firstLine="0"/>
+              <w:jc w:val="left"/>
+            </w:pPr>
+            <w:r>
+              <w:rPr>
+                <w:rFonts w:ascii="Times New Roman" w:hAnsi="Times New Roman" w:eastAsia="宋体"/>
+                <w:b w:val="0"/>
+                <w:color w:val="000000"/>
+                <w:sz w:val="21"/>
+              </w:rPr>
+              <w:t>叠加符号与噪声</w:t>
+            </w:r>
+          </w:p>
+        </w:tc>
+        <w:tc>
+          <w:tcPr>
+            <w:tcW w:type="dxa" w:w="7087"/>
+            <w:vAlign w:val="center"/>
+          </w:tcPr>
+          <w:p>
+            <w:pPr>
+              <w:spacing w:after="0" w:line="280" w:lineRule="exact"/>
+              <w:ind w:firstLine="0"/>
+              <w:jc w:val="left"/>
+            </w:pPr>
+            <w:r>
+              <w:rPr>
+                <w:rFonts w:ascii="Times New Roman" w:hAnsi="Times New Roman" w:eastAsia="宋体"/>
+                <w:b w:val="0"/>
+                <w:color w:val="000000"/>
+                <w:sz w:val="21"/>
+              </w:rPr>
+              <w:t>包含 NH20 和简化导航位；未叠加噪声</w:t>
+            </w:r>
+          </w:p>
+        </w:tc>
+      </w:tr>
+    </w:tbl>
+    <w:p>
+      <w:pPr>
+        <w:spacing w:after="80" w:line="300" w:lineRule="exact"/>
+        <w:ind w:firstLine="0"/>
+        <w:jc w:val="both"/>
+      </w:pPr>
+      <w:r>
+        <w:rPr>
+          <w:rFonts w:ascii="Times New Roman" w:hAnsi="Times New Roman" w:eastAsia="宋体"/>
+          <w:b w:val="0"/>
+          <w:color w:val="000000"/>
+          <w:sz w:val="22"/>
+        </w:rPr>
+        <w:t>该源逐拍输出一个有符号样本，其位模式与第 1 节公开 IF2 文件的四电平量化含义不同。接收端直接按有符号数解释，00 必须保留为零。源中的导航序列经过简化，本实验只评价捕获过程。</w:t>
+      </w:r>
+    </w:p>
+    <w:p>
+      <w:pPr>
+        <w:pStyle w:val="21"/>
+      </w:pPr>
+      <w:r>
+        <w:t>10.2 搜索与能量判决</w:t>
+      </w:r>
+    </w:p>
+    <w:p>
+      <w:pPr>
+        <w:spacing w:after="80" w:line="360" w:lineRule="exact"/>
+        <w:ind w:firstLine="482"/>
+        <w:jc w:val="both"/>
+      </w:pPr>
+      <w:r>
+        <w:rPr>
+          <w:rFonts w:ascii="Times New Roman" w:hAnsi="Times New Roman" w:eastAsia="宋体"/>
+          <w:b w:val="0"/>
+          <w:color w:val="000000"/>
+          <w:sz w:val="24"/>
+        </w:rPr>
+        <w:t>本地码由独立的码发生器生成。接收机从起始位置 0 开始，每轮处理 16368 个有效样本；未达到门限时，将本地码的起始位置增加 1，达到 2045 后回到 0。输入无效时，样本计数、本地码位置和载波位置均保持。信号源的调试码线仅供测试台显示和核对，不参与捕获判决。</w:t>
+      </w:r>
+    </w:p>
+    <w:p>
+      <w:pPr>
+        <w:spacing w:after="80" w:line="360" w:lineRule="exact"/>
+        <w:ind w:firstLine="482"/>
+        <w:jc w:val="both"/>
+      </w:pPr>
+      <w:r>
+        <w:rPr>
+          <w:rFonts w:ascii="Times New Roman" w:hAnsi="Times New Roman" w:eastAsia="宋体"/>
+          <w:b w:val="0"/>
+          <w:color w:val="000000"/>
+          <w:sz w:val="24"/>
+        </w:rPr>
+        <w:t>每个样本与本地载波及本地码相乘，分别累加得到 I、Q。最后一个样本计入后，再计算并锁存相关能量：</w:t>
+      </w:r>
+    </w:p>
+    <w:p>
+      <w:pPr>
+        <w:spacing w:after="100" w:line="380" w:lineRule="exact"/>
+        <w:jc w:val="center"/>
+      </w:pPr>
+      <m:oMath>
+        <m:r>
+          <m:t>E = </m:t>
+        </m:r>
+        <m:sSup>
+          <m:e>
+            <m:r>
+              <m:t>I</m:t>
+            </m:r>
+          </m:e>
+          <m:sup>
+            <m:r>
+              <m:t>2</m:t>
+            </m:r>
+          </m:sup>
+        </m:sSup>
+        <m:r>
+          <m:t> + </m:t>
+        </m:r>
+        <m:sSup>
+          <m:e>
+            <m:r>
+              <m:t>Q</m:t>
+            </m:r>
+          </m:e>
+          <m:sup>
+            <m:r>
+              <m:t>2</m:t>
+            </m:r>
+          </m:sup>
+        </m:sSup>
+      </m:oMath>
+    </w:p>
+    <w:p>
+      <w:pPr>
+        <w:spacing w:after="80" w:line="300" w:lineRule="exact"/>
+        <w:ind w:firstLine="0"/>
+        <w:jc w:val="both"/>
+      </w:pPr>
+      <w:r>
+        <w:rPr>
+          <w:rFonts w:ascii="Times New Roman" w:hAnsi="Times New Roman" w:eastAsia="宋体"/>
+          <w:b w:val="0"/>
+          <w:color w:val="000000"/>
+          <w:sz w:val="22"/>
+        </w:rPr>
+        <w:t>能量门限为 67 108 864，即 8192 的平方。E 达到门限时置 capture，并保存成功位置；随后保持该位置继续比较。dump 在每轮结束时输出一个时钟周期的提示。I、Q 为 24 位有符号数，平方采用 48 位，能量之和采用 49 位无符号数。</w:t>
+      </w:r>
+    </w:p>
+    <w:p>
+      <w:pPr>
+        <w:pStyle w:val="21"/>
+        <w:pageBreakBefore/>
+      </w:pPr>
+      <w:r>
+        <w:t>10.3 逐轮仿真结果</w:t>
+      </w:r>
+    </w:p>
+    <w:p>
+      <w:pPr>
+        <w:spacing w:after="80" w:line="360" w:lineRule="exact"/>
+        <w:ind w:firstLine="482"/>
+        <w:jc w:val="both"/>
+      </w:pPr>
+      <w:r>
+        <w:rPr>
+          <w:rFonts w:ascii="Times New Roman" w:hAnsi="Times New Roman" w:eastAsia="宋体"/>
+          <w:b w:val="0"/>
+          <w:color w:val="000000"/>
+          <w:sz w:val="24"/>
+        </w:rPr>
+        <w:t>2026 年 10 月 19 日在 ModelSim SE-64 10.5 中运行教师实际信号源和捕获 RTL。表中位置与能量属于刚完成的同一窗口。前 10 轮逐次搜索，第 11 轮首次达到门限，随后完成两个确认窗口。</w:t>
+      </w:r>
+    </w:p>
+    <w:tbl>
+      <w:tblPr>
+        <w:tblW w:type="auto" w:w="0"/>
+        <w:jc w:val="center"/>
+        <w:tblLayout w:type="fixed"/>
+        <w:tblLook w:firstColumn="1" w:firstRow="1" w:lastColumn="0" w:lastRow="0" w:noHBand="0" w:noVBand="1" w:val="04A0"/>
+        <w:tblBorders>
+          <w:top w:val="single" w:sz="4" w:color="D9D9D9"/>
+          <w:left w:val="single" w:sz="4" w:color="D9D9D9"/>
+          <w:bottom w:val="single" w:sz="4" w:color="D9D9D9"/>
+          <w:right w:val="single" w:sz="4" w:color="D9D9D9"/>
+          <w:insideH w:val="single" w:sz="4" w:color="D9D9D9"/>
+          <w:insideV w:val="single" w:sz="4" w:color="D9D9D9"/>
+        </w:tblBorders>
+        <w:tblCellMar>
+          <w:top w:w="75" w:type="dxa"/>
+          <w:bottom w:w="75" w:type="dxa"/>
+          <w:left w:w="100" w:type="dxa"/>
+          <w:right w:w="100" w:type="dxa"/>
+        </w:tblCellMar>
+      </w:tblPr>
+      <w:tblGrid>
+        <w:gridCol w:w="850"/>
+        <w:gridCol w:w="1134"/>
+        <w:gridCol w:w="1814"/>
+        <w:gridCol w:w="3685"/>
+        <w:gridCol w:w="1587"/>
+      </w:tblGrid>
+      <w:tr>
+        <w:trPr>
+          <w:cantSplit/>
+          <w:tblHeader/>
+        </w:trPr>
+        <w:tc>
+          <w:tcPr>
+            <w:tcW w:type="dxa" w:w="850"/>
+            <w:vAlign w:val="center"/>
+            <w:shd w:fill="F2F2F2"/>
+          </w:tcPr>
+          <w:p>
+            <w:pPr>
+              <w:spacing w:after="0" w:line="280" w:lineRule="exact"/>
+              <w:ind w:firstLine="0"/>
+              <w:jc w:val="center"/>
+            </w:pPr>
+            <w:r>
+              <w:rPr>
+                <w:rFonts w:ascii="Times New Roman" w:hAnsi="Times New Roman" w:eastAsia="宋体"/>
+                <w:b/>
+                <w:color w:val="000000"/>
+                <w:sz w:val="21"/>
+              </w:rPr>
+              <w:t>窗口</w:t>
+            </w:r>
+          </w:p>
+        </w:tc>
+        <w:tc>
+          <w:tcPr>
+            <w:tcW w:type="dxa" w:w="1134"/>
+            <w:vAlign w:val="center"/>
+            <w:shd w:fill="F2F2F2"/>
+          </w:tcPr>
+          <w:p>
+            <w:pPr>
+              <w:spacing w:after="0" w:line="280" w:lineRule="exact"/>
+              <w:ind w:firstLine="0"/>
+              <w:jc w:val="center"/>
+            </w:pPr>
+            <w:r>
+              <w:rPr>
+                <w:rFonts w:ascii="Times New Roman" w:hAnsi="Times New Roman" w:eastAsia="宋体"/>
+                <w:b/>
+                <w:color w:val="000000"/>
+                <w:sz w:val="21"/>
+              </w:rPr>
+              <w:t>起始位置</w:t>
+            </w:r>
+          </w:p>
+        </w:tc>
+        <w:tc>
+          <w:tcPr>
+            <w:tcW w:type="dxa" w:w="1814"/>
+            <w:vAlign w:val="center"/>
+            <w:shd w:fill="F2F2F2"/>
+          </w:tcPr>
+          <w:p>
+            <w:pPr>
+              <w:spacing w:after="0" w:line="280" w:lineRule="exact"/>
+              <w:ind w:firstLine="0"/>
+              <w:jc w:val="center"/>
+            </w:pPr>
+            <w:r>
+              <w:rPr>
+                <w:rFonts w:ascii="Times New Roman" w:hAnsi="Times New Roman" w:eastAsia="宋体"/>
+                <w:b/>
+                <w:color w:val="000000"/>
+                <w:sz w:val="21"/>
+              </w:rPr>
+              <w:t>Q 累加值</w:t>
+            </w:r>
+          </w:p>
+        </w:tc>
+        <w:tc>
+          <w:tcPr>
+            <w:tcW w:type="dxa" w:w="3685"/>
+            <w:vAlign w:val="center"/>
+            <w:shd w:fill="F2F2F2"/>
+          </w:tcPr>
+          <w:p>
+            <w:pPr>
+              <w:spacing w:after="0" w:line="280" w:lineRule="exact"/>
+              <w:ind w:firstLine="0"/>
+              <w:jc w:val="center"/>
+            </w:pPr>
+            <w:r>
+              <w:rPr>
+                <w:rFonts w:ascii="Times New Roman" w:hAnsi="Times New Roman" w:eastAsia="宋体"/>
+                <w:b/>
+                <w:color w:val="000000"/>
+                <w:sz w:val="21"/>
+              </w:rPr>
+              <w:t>相关能量 E</w:t>
+            </w:r>
+          </w:p>
+        </w:tc>
+        <w:tc>
+          <w:tcPr>
+            <w:tcW w:type="dxa" w:w="1587"/>
+            <w:vAlign w:val="center"/>
+            <w:shd w:fill="F2F2F2"/>
+          </w:tcPr>
+          <w:p>
+            <w:pPr>
+              <w:spacing w:after="0" w:line="280" w:lineRule="exact"/>
+              <w:ind w:firstLine="0"/>
+              <w:jc w:val="center"/>
+            </w:pPr>
+            <w:r>
+              <w:rPr>
+                <w:rFonts w:ascii="Times New Roman" w:hAnsi="Times New Roman" w:eastAsia="宋体"/>
+                <w:b/>
+                <w:color w:val="000000"/>
+                <w:sz w:val="21"/>
+              </w:rPr>
+              <w:t>capture</w:t>
+            </w:r>
+          </w:p>
+        </w:tc>
+      </w:tr>
+      <w:tr>
+        <w:trPr>
+          <w:cantSplit/>
+        </w:trPr>
+        <w:tc>
+          <w:tcPr>
+            <w:tcW w:type="dxa" w:w="850"/>
+            <w:vAlign w:val="center"/>
+          </w:tcPr>
+          <w:p>
+            <w:pPr>
+              <w:spacing w:after="0" w:line="280" w:lineRule="exact"/>
+              <w:ind w:firstLine="0"/>
+              <w:jc w:val="center"/>
+            </w:pPr>
+            <w:r>
+              <w:rPr>
+                <w:rFonts w:ascii="Times New Roman" w:hAnsi="Times New Roman" w:eastAsia="宋体"/>
+                <w:b w:val="0"/>
+                <w:color w:val="000000"/>
+                <w:sz w:val="21"/>
+              </w:rPr>
+              <w:t>1</w:t>
+            </w:r>
+          </w:p>
+        </w:tc>
+        <w:tc>
+          <w:tcPr>
+            <w:tcW w:type="dxa" w:w="1134"/>
+            <w:vAlign w:val="center"/>
+          </w:tcPr>
+          <w:p>
+            <w:pPr>
+              <w:spacing w:after="0" w:line="280" w:lineRule="exact"/>
+              <w:ind w:firstLine="0"/>
+              <w:jc w:val="center"/>
+            </w:pPr>
+            <w:r>
+              <w:rPr>
+                <w:rFonts w:ascii="Times New Roman" w:hAnsi="Times New Roman" w:eastAsia="宋体"/>
+                <w:b w:val="0"/>
+                <w:color w:val="000000"/>
+                <w:sz w:val="21"/>
+              </w:rPr>
+              <w:t>0</w:t>
+            </w:r>
+          </w:p>
+        </w:tc>
+        <w:tc>
+          <w:tcPr>
+            <w:tcW w:type="dxa" w:w="1814"/>
+            <w:vAlign w:val="center"/>
+          </w:tcPr>
+          <w:p>
+            <w:pPr>
+              <w:spacing w:after="0" w:line="280" w:lineRule="exact"/>
+              <w:ind w:firstLine="0"/>
+              <w:jc w:val="center"/>
+            </w:pPr>
+            <w:r>
+              <w:rPr>
+                <w:rFonts w:ascii="Times New Roman" w:hAnsi="Times New Roman" w:eastAsia="宋体"/>
+                <w:b w:val="0"/>
+                <w:color w:val="000000"/>
+                <w:sz w:val="21"/>
+              </w:rPr>
+              <w:t>-1,624</w:t>
+            </w:r>
+          </w:p>
+        </w:tc>
+        <w:tc>
+          <w:tcPr>
+            <w:tcW w:type="dxa" w:w="3685"/>
+            <w:vAlign w:val="center"/>
+          </w:tcPr>
+          <w:p>
+            <w:pPr>
+              <w:spacing w:after="0" w:line="280" w:lineRule="exact"/>
+              <w:ind w:firstLine="0"/>
+              <w:jc w:val="center"/>
+            </w:pPr>
+            <w:r>
+              <w:rPr>
+                <w:rFonts w:ascii="Times New Roman" w:hAnsi="Times New Roman" w:eastAsia="宋体"/>
+                <w:b w:val="0"/>
+                <w:color w:val="000000"/>
+                <w:sz w:val="21"/>
+              </w:rPr>
+              <w:t>2,637,376</w:t>
+            </w:r>
+          </w:p>
+        </w:tc>
+        <w:tc>
+          <w:tcPr>
+            <w:tcW w:type="dxa" w:w="1587"/>
+            <w:vAlign w:val="center"/>
+          </w:tcPr>
+          <w:p>
+            <w:pPr>
+              <w:spacing w:after="0" w:line="280" w:lineRule="exact"/>
+              <w:ind w:firstLine="0"/>
+              <w:jc w:val="center"/>
+            </w:pPr>
+            <w:r>
+              <w:rPr>
+                <w:rFonts w:ascii="Times New Roman" w:hAnsi="Times New Roman" w:eastAsia="宋体"/>
+                <w:b w:val="0"/>
+                <w:color w:val="000000"/>
+                <w:sz w:val="21"/>
+              </w:rPr>
+              <w:t>0</w:t>
+            </w:r>
+          </w:p>
+        </w:tc>
+      </w:tr>
+      <w:tr>
+        <w:trPr>
+          <w:cantSplit/>
+        </w:trPr>
+        <w:tc>
+          <w:tcPr>
+            <w:tcW w:type="dxa" w:w="850"/>
+            <w:vAlign w:val="center"/>
+          </w:tcPr>
+          <w:p>
+            <w:pPr>
+              <w:spacing w:after="0" w:line="280" w:lineRule="exact"/>
+              <w:ind w:firstLine="0"/>
+              <w:jc w:val="center"/>
+            </w:pPr>
+            <w:r>
+              <w:rPr>
+                <w:rFonts w:ascii="Times New Roman" w:hAnsi="Times New Roman" w:eastAsia="宋体"/>
+                <w:b w:val="0"/>
+                <w:color w:val="000000"/>
+                <w:sz w:val="21"/>
+              </w:rPr>
+              <w:t>2</w:t>
+            </w:r>
+          </w:p>
+        </w:tc>
+        <w:tc>
+          <w:tcPr>
+            <w:tcW w:type="dxa" w:w="1134"/>
+            <w:vAlign w:val="center"/>
+          </w:tcPr>
+          <w:p>
+            <w:pPr>
+              <w:spacing w:after="0" w:line="280" w:lineRule="exact"/>
+              <w:ind w:firstLine="0"/>
+              <w:jc w:val="center"/>
+            </w:pPr>
+            <w:r>
+              <w:rPr>
+                <w:rFonts w:ascii="Times New Roman" w:hAnsi="Times New Roman" w:eastAsia="宋体"/>
+                <w:b w:val="0"/>
+                <w:color w:val="000000"/>
+                <w:sz w:val="21"/>
+              </w:rPr>
+              <w:t>1</w:t>
+            </w:r>
+          </w:p>
+        </w:tc>
+        <w:tc>
+          <w:tcPr>
+            <w:tcW w:type="dxa" w:w="1814"/>
+            <w:vAlign w:val="center"/>
+          </w:tcPr>
+          <w:p>
+            <w:pPr>
+              <w:spacing w:after="0" w:line="280" w:lineRule="exact"/>
+              <w:ind w:firstLine="0"/>
+              <w:jc w:val="center"/>
+            </w:pPr>
+            <w:r>
+              <w:rPr>
+                <w:rFonts w:ascii="Times New Roman" w:hAnsi="Times New Roman" w:eastAsia="宋体"/>
+                <w:b w:val="0"/>
+                <w:color w:val="000000"/>
+                <w:sz w:val="21"/>
+              </w:rPr>
+              <w:t>-56</w:t>
+            </w:r>
+          </w:p>
+        </w:tc>
+        <w:tc>
+          <w:tcPr>
+            <w:tcW w:type="dxa" w:w="3685"/>
+            <w:vAlign w:val="center"/>
+          </w:tcPr>
+          <w:p>
+            <w:pPr>
+              <w:spacing w:after="0" w:line="280" w:lineRule="exact"/>
+              <w:ind w:firstLine="0"/>
+              <w:jc w:val="center"/>
+            </w:pPr>
+            <w:r>
+              <w:rPr>
+                <w:rFonts w:ascii="Times New Roman" w:hAnsi="Times New Roman" w:eastAsia="宋体"/>
+                <w:b w:val="0"/>
+                <w:color w:val="000000"/>
+                <w:sz w:val="21"/>
+              </w:rPr>
+              <w:t>3,136</w:t>
+            </w:r>
+          </w:p>
+        </w:tc>
+        <w:tc>
+          <w:tcPr>
+            <w:tcW w:type="dxa" w:w="1587"/>
+            <w:vAlign w:val="center"/>
+          </w:tcPr>
+          <w:p>
+            <w:pPr>
+              <w:spacing w:after="0" w:line="280" w:lineRule="exact"/>
+              <w:ind w:firstLine="0"/>
+              <w:jc w:val="center"/>
+            </w:pPr>
+            <w:r>
+              <w:rPr>
+                <w:rFonts w:ascii="Times New Roman" w:hAnsi="Times New Roman" w:eastAsia="宋体"/>
+                <w:b w:val="0"/>
+                <w:color w:val="000000"/>
+                <w:sz w:val="21"/>
+              </w:rPr>
+              <w:t>0</w:t>
+            </w:r>
+          </w:p>
+        </w:tc>
+      </w:tr>
+      <w:tr>
+        <w:trPr>
+          <w:cantSplit/>
+        </w:trPr>
+        <w:tc>
+          <w:tcPr>
+            <w:tcW w:type="dxa" w:w="850"/>
+            <w:vAlign w:val="center"/>
+          </w:tcPr>
+          <w:p>
+            <w:pPr>
+              <w:spacing w:after="0" w:line="280" w:lineRule="exact"/>
+              <w:ind w:firstLine="0"/>
+              <w:jc w:val="center"/>
+            </w:pPr>
+            <w:r>
+              <w:rPr>
+                <w:rFonts w:ascii="Times New Roman" w:hAnsi="Times New Roman" w:eastAsia="宋体"/>
+                <w:b w:val="0"/>
+                <w:color w:val="000000"/>
+                <w:sz w:val="21"/>
+              </w:rPr>
+              <w:t>3</w:t>
+            </w:r>
+          </w:p>
+        </w:tc>
+        <w:tc>
+          <w:tcPr>
+            <w:tcW w:type="dxa" w:w="1134"/>
+            <w:vAlign w:val="center"/>
+          </w:tcPr>
+          <w:p>
+            <w:pPr>
+              <w:spacing w:after="0" w:line="280" w:lineRule="exact"/>
+              <w:ind w:firstLine="0"/>
+              <w:jc w:val="center"/>
+            </w:pPr>
+            <w:r>
+              <w:rPr>
+                <w:rFonts w:ascii="Times New Roman" w:hAnsi="Times New Roman" w:eastAsia="宋体"/>
+                <w:b w:val="0"/>
+                <w:color w:val="000000"/>
+                <w:sz w:val="21"/>
+              </w:rPr>
+              <w:t>2</w:t>
+            </w:r>
+          </w:p>
+        </w:tc>
+        <w:tc>
+          <w:tcPr>
+            <w:tcW w:type="dxa" w:w="1814"/>
+            <w:vAlign w:val="center"/>
+          </w:tcPr>
+          <w:p>
+            <w:pPr>
+              <w:spacing w:after="0" w:line="280" w:lineRule="exact"/>
+              <w:ind w:firstLine="0"/>
+              <w:jc w:val="center"/>
+            </w:pPr>
+            <w:r>
+              <w:rPr>
+                <w:rFonts w:ascii="Times New Roman" w:hAnsi="Times New Roman" w:eastAsia="宋体"/>
+                <w:b w:val="0"/>
+                <w:color w:val="000000"/>
+                <w:sz w:val="21"/>
+              </w:rPr>
+              <w:t>56</w:t>
+            </w:r>
+          </w:p>
+        </w:tc>
+        <w:tc>
+          <w:tcPr>
+            <w:tcW w:type="dxa" w:w="3685"/>
+            <w:vAlign w:val="center"/>
+          </w:tcPr>
+          <w:p>
+            <w:pPr>
+              <w:spacing w:after="0" w:line="280" w:lineRule="exact"/>
+              <w:ind w:firstLine="0"/>
+              <w:jc w:val="center"/>
+            </w:pPr>
+            <w:r>
+              <w:rPr>
+                <w:rFonts w:ascii="Times New Roman" w:hAnsi="Times New Roman" w:eastAsia="宋体"/>
+                <w:b w:val="0"/>
+                <w:color w:val="000000"/>
+                <w:sz w:val="21"/>
+              </w:rPr>
+              <w:t>3,136</w:t>
+            </w:r>
+          </w:p>
+        </w:tc>
+        <w:tc>
+          <w:tcPr>
+            <w:tcW w:type="dxa" w:w="1587"/>
+            <w:vAlign w:val="center"/>
+          </w:tcPr>
+          <w:p>
+            <w:pPr>
+              <w:spacing w:after="0" w:line="280" w:lineRule="exact"/>
+              <w:ind w:firstLine="0"/>
+              <w:jc w:val="center"/>
+            </w:pPr>
+            <w:r>
+              <w:rPr>
+                <w:rFonts w:ascii="Times New Roman" w:hAnsi="Times New Roman" w:eastAsia="宋体"/>
+                <w:b w:val="0"/>
+                <w:color w:val="000000"/>
+                <w:sz w:val="21"/>
+              </w:rPr>
+              <w:t>0</w:t>
+            </w:r>
+          </w:p>
+        </w:tc>
+      </w:tr>
+      <w:tr>
+        <w:trPr>
+          <w:cantSplit/>
+        </w:trPr>
+        <w:tc>
+          <w:tcPr>
+            <w:tcW w:type="dxa" w:w="850"/>
+            <w:vAlign w:val="center"/>
+          </w:tcPr>
+          <w:p>
+            <w:pPr>
+              <w:spacing w:after="0" w:line="280" w:lineRule="exact"/>
+              <w:ind w:firstLine="0"/>
+              <w:jc w:val="center"/>
+            </w:pPr>
+            <w:r>
+              <w:rPr>
+                <w:rFonts w:ascii="Times New Roman" w:hAnsi="Times New Roman" w:eastAsia="宋体"/>
+                <w:b w:val="0"/>
+                <w:color w:val="000000"/>
+                <w:sz w:val="21"/>
+              </w:rPr>
+              <w:t>4</w:t>
+            </w:r>
+          </w:p>
+        </w:tc>
+        <w:tc>
+          <w:tcPr>
+            <w:tcW w:type="dxa" w:w="1134"/>
+            <w:vAlign w:val="center"/>
+          </w:tcPr>
+          <w:p>
+            <w:pPr>
+              <w:spacing w:after="0" w:line="280" w:lineRule="exact"/>
+              <w:ind w:firstLine="0"/>
+              <w:jc w:val="center"/>
+            </w:pPr>
+            <w:r>
+              <w:rPr>
+                <w:rFonts w:ascii="Times New Roman" w:hAnsi="Times New Roman" w:eastAsia="宋体"/>
+                <w:b w:val="0"/>
+                <w:color w:val="000000"/>
+                <w:sz w:val="21"/>
+              </w:rPr>
+              <w:t>3</w:t>
+            </w:r>
+          </w:p>
+        </w:tc>
+        <w:tc>
+          <w:tcPr>
+            <w:tcW w:type="dxa" w:w="1814"/>
+            <w:vAlign w:val="center"/>
+          </w:tcPr>
+          <w:p>
+            <w:pPr>
+              <w:spacing w:after="0" w:line="280" w:lineRule="exact"/>
+              <w:ind w:firstLine="0"/>
+              <w:jc w:val="center"/>
+            </w:pPr>
+            <w:r>
+              <w:rPr>
+                <w:rFonts w:ascii="Times New Roman" w:hAnsi="Times New Roman" w:eastAsia="宋体"/>
+                <w:b w:val="0"/>
+                <w:color w:val="000000"/>
+                <w:sz w:val="21"/>
+              </w:rPr>
+              <w:t>-1,736</w:t>
+            </w:r>
+          </w:p>
+        </w:tc>
+        <w:tc>
+          <w:tcPr>
+            <w:tcW w:type="dxa" w:w="3685"/>
+            <w:vAlign w:val="center"/>
+          </w:tcPr>
+          <w:p>
+            <w:pPr>
+              <w:spacing w:after="0" w:line="280" w:lineRule="exact"/>
+              <w:ind w:firstLine="0"/>
+              <w:jc w:val="center"/>
+            </w:pPr>
+            <w:r>
+              <w:rPr>
+                <w:rFonts w:ascii="Times New Roman" w:hAnsi="Times New Roman" w:eastAsia="宋体"/>
+                <w:b w:val="0"/>
+                <w:color w:val="000000"/>
+                <w:sz w:val="21"/>
+              </w:rPr>
+              <w:t>3,013,696</w:t>
+            </w:r>
+          </w:p>
+        </w:tc>
+        <w:tc>
+          <w:tcPr>
+            <w:tcW w:type="dxa" w:w="1587"/>
+            <w:vAlign w:val="center"/>
+          </w:tcPr>
+          <w:p>
+            <w:pPr>
+              <w:spacing w:after="0" w:line="280" w:lineRule="exact"/>
+              <w:ind w:firstLine="0"/>
+              <w:jc w:val="center"/>
+            </w:pPr>
+            <w:r>
+              <w:rPr>
+                <w:rFonts w:ascii="Times New Roman" w:hAnsi="Times New Roman" w:eastAsia="宋体"/>
+                <w:b w:val="0"/>
+                <w:color w:val="000000"/>
+                <w:sz w:val="21"/>
+              </w:rPr>
+              <w:t>0</w:t>
+            </w:r>
+          </w:p>
+        </w:tc>
+      </w:tr>
+      <w:tr>
+        <w:trPr>
+          <w:cantSplit/>
+        </w:trPr>
+        <w:tc>
+          <w:tcPr>
+            <w:tcW w:type="dxa" w:w="850"/>
+            <w:vAlign w:val="center"/>
+          </w:tcPr>
+          <w:p>
+            <w:pPr>
+              <w:spacing w:after="0" w:line="280" w:lineRule="exact"/>
+              <w:ind w:firstLine="0"/>
+              <w:jc w:val="center"/>
+            </w:pPr>
+            <w:r>
+              <w:rPr>
+                <w:rFonts w:ascii="Times New Roman" w:hAnsi="Times New Roman" w:eastAsia="宋体"/>
+                <w:b w:val="0"/>
+                <w:color w:val="000000"/>
+                <w:sz w:val="21"/>
+              </w:rPr>
+              <w:t>5</w:t>
+            </w:r>
+          </w:p>
+        </w:tc>
+        <w:tc>
+          <w:tcPr>
+            <w:tcW w:type="dxa" w:w="1134"/>
+            <w:vAlign w:val="center"/>
+          </w:tcPr>
+          <w:p>
+            <w:pPr>
+              <w:spacing w:after="0" w:line="280" w:lineRule="exact"/>
+              <w:ind w:firstLine="0"/>
+              <w:jc w:val="center"/>
+            </w:pPr>
+            <w:r>
+              <w:rPr>
+                <w:rFonts w:ascii="Times New Roman" w:hAnsi="Times New Roman" w:eastAsia="宋体"/>
+                <w:b w:val="0"/>
+                <w:color w:val="000000"/>
+                <w:sz w:val="21"/>
+              </w:rPr>
+              <w:t>4</w:t>
+            </w:r>
+          </w:p>
+        </w:tc>
+        <w:tc>
+          <w:tcPr>
+            <w:tcW w:type="dxa" w:w="1814"/>
+            <w:vAlign w:val="center"/>
+          </w:tcPr>
+          <w:p>
+            <w:pPr>
+              <w:spacing w:after="0" w:line="280" w:lineRule="exact"/>
+              <w:ind w:firstLine="0"/>
+              <w:jc w:val="center"/>
+            </w:pPr>
+            <w:r>
+              <w:rPr>
+                <w:rFonts w:ascii="Times New Roman" w:hAnsi="Times New Roman" w:eastAsia="宋体"/>
+                <w:b w:val="0"/>
+                <w:color w:val="000000"/>
+                <w:sz w:val="21"/>
+              </w:rPr>
+              <w:t>1,848</w:t>
+            </w:r>
+          </w:p>
+        </w:tc>
+        <w:tc>
+          <w:tcPr>
+            <w:tcW w:type="dxa" w:w="3685"/>
+            <w:vAlign w:val="center"/>
+          </w:tcPr>
+          <w:p>
+            <w:pPr>
+              <w:spacing w:after="0" w:line="280" w:lineRule="exact"/>
+              <w:ind w:firstLine="0"/>
+              <w:jc w:val="center"/>
+            </w:pPr>
+            <w:r>
+              <w:rPr>
+                <w:rFonts w:ascii="Times New Roman" w:hAnsi="Times New Roman" w:eastAsia="宋体"/>
+                <w:b w:val="0"/>
+                <w:color w:val="000000"/>
+                <w:sz w:val="21"/>
+              </w:rPr>
+              <w:t>3,415,104</w:t>
+            </w:r>
+          </w:p>
+        </w:tc>
+        <w:tc>
+          <w:tcPr>
+            <w:tcW w:type="dxa" w:w="1587"/>
+            <w:vAlign w:val="center"/>
+          </w:tcPr>
+          <w:p>
+            <w:pPr>
+              <w:spacing w:after="0" w:line="280" w:lineRule="exact"/>
+              <w:ind w:firstLine="0"/>
+              <w:jc w:val="center"/>
+            </w:pPr>
+            <w:r>
+              <w:rPr>
+                <w:rFonts w:ascii="Times New Roman" w:hAnsi="Times New Roman" w:eastAsia="宋体"/>
+                <w:b w:val="0"/>
+                <w:color w:val="000000"/>
+                <w:sz w:val="21"/>
+              </w:rPr>
+              <w:t>0</w:t>
+            </w:r>
+          </w:p>
+        </w:tc>
+      </w:tr>
+      <w:tr>
+        <w:trPr>
+          <w:cantSplit/>
+        </w:trPr>
+        <w:tc>
+          <w:tcPr>
+            <w:tcW w:type="dxa" w:w="850"/>
+            <w:vAlign w:val="center"/>
+          </w:tcPr>
+          <w:p>
+            <w:pPr>
+              <w:spacing w:after="0" w:line="280" w:lineRule="exact"/>
+              <w:ind w:firstLine="0"/>
+              <w:jc w:val="center"/>
+            </w:pPr>
+            <w:r>
+              <w:rPr>
+                <w:rFonts w:ascii="Times New Roman" w:hAnsi="Times New Roman" w:eastAsia="宋体"/>
+                <w:b w:val="0"/>
+                <w:color w:val="000000"/>
+                <w:sz w:val="21"/>
+              </w:rPr>
+              <w:t>6</w:t>
+            </w:r>
+          </w:p>
+        </w:tc>
+        <w:tc>
+          <w:tcPr>
+            <w:tcW w:type="dxa" w:w="1134"/>
+            <w:vAlign w:val="center"/>
+          </w:tcPr>
+          <w:p>
+            <w:pPr>
+              <w:spacing w:after="0" w:line="280" w:lineRule="exact"/>
+              <w:ind w:firstLine="0"/>
+              <w:jc w:val="center"/>
+            </w:pPr>
+            <w:r>
+              <w:rPr>
+                <w:rFonts w:ascii="Times New Roman" w:hAnsi="Times New Roman" w:eastAsia="宋体"/>
+                <w:b w:val="0"/>
+                <w:color w:val="000000"/>
+                <w:sz w:val="21"/>
+              </w:rPr>
+              <w:t>5</w:t>
+            </w:r>
+          </w:p>
+        </w:tc>
+        <w:tc>
+          <w:tcPr>
+            <w:tcW w:type="dxa" w:w="1814"/>
+            <w:vAlign w:val="center"/>
+          </w:tcPr>
+          <w:p>
+            <w:pPr>
+              <w:spacing w:after="0" w:line="280" w:lineRule="exact"/>
+              <w:ind w:firstLine="0"/>
+              <w:jc w:val="center"/>
+            </w:pPr>
+            <w:r>
+              <w:rPr>
+                <w:rFonts w:ascii="Times New Roman" w:hAnsi="Times New Roman" w:eastAsia="宋体"/>
+                <w:b w:val="0"/>
+                <w:color w:val="000000"/>
+                <w:sz w:val="21"/>
+              </w:rPr>
+              <w:t>-56</w:t>
+            </w:r>
+          </w:p>
+        </w:tc>
+        <w:tc>
+          <w:tcPr>
+            <w:tcW w:type="dxa" w:w="3685"/>
+            <w:vAlign w:val="center"/>
+          </w:tcPr>
+          <w:p>
+            <w:pPr>
+              <w:spacing w:after="0" w:line="280" w:lineRule="exact"/>
+              <w:ind w:firstLine="0"/>
+              <w:jc w:val="center"/>
+            </w:pPr>
+            <w:r>
+              <w:rPr>
+                <w:rFonts w:ascii="Times New Roman" w:hAnsi="Times New Roman" w:eastAsia="宋体"/>
+                <w:b w:val="0"/>
+                <w:color w:val="000000"/>
+                <w:sz w:val="21"/>
+              </w:rPr>
+              <w:t>3,136</w:t>
+            </w:r>
+          </w:p>
+        </w:tc>
+        <w:tc>
+          <w:tcPr>
+            <w:tcW w:type="dxa" w:w="1587"/>
+            <w:vAlign w:val="center"/>
+          </w:tcPr>
+          <w:p>
+            <w:pPr>
+              <w:spacing w:after="0" w:line="280" w:lineRule="exact"/>
+              <w:ind w:firstLine="0"/>
+              <w:jc w:val="center"/>
+            </w:pPr>
+            <w:r>
+              <w:rPr>
+                <w:rFonts w:ascii="Times New Roman" w:hAnsi="Times New Roman" w:eastAsia="宋体"/>
+                <w:b w:val="0"/>
+                <w:color w:val="000000"/>
+                <w:sz w:val="21"/>
+              </w:rPr>
+              <w:t>0</w:t>
+            </w:r>
+          </w:p>
+        </w:tc>
+      </w:tr>
+      <w:tr>
+        <w:trPr>
+          <w:cantSplit/>
+        </w:trPr>
+        <w:tc>
+          <w:tcPr>
+            <w:tcW w:type="dxa" w:w="850"/>
+            <w:vAlign w:val="center"/>
+          </w:tcPr>
+          <w:p>
+            <w:pPr>
+              <w:spacing w:after="0" w:line="280" w:lineRule="exact"/>
+              <w:ind w:firstLine="0"/>
+              <w:jc w:val="center"/>
+            </w:pPr>
+            <w:r>
+              <w:rPr>
+                <w:rFonts w:ascii="Times New Roman" w:hAnsi="Times New Roman" w:eastAsia="宋体"/>
+                <w:b w:val="0"/>
+                <w:color w:val="000000"/>
+                <w:sz w:val="21"/>
+              </w:rPr>
+              <w:t>7</w:t>
+            </w:r>
+          </w:p>
+        </w:tc>
+        <w:tc>
+          <w:tcPr>
+            <w:tcW w:type="dxa" w:w="1134"/>
+            <w:vAlign w:val="center"/>
+          </w:tcPr>
+          <w:p>
+            <w:pPr>
+              <w:spacing w:after="0" w:line="280" w:lineRule="exact"/>
+              <w:ind w:firstLine="0"/>
+              <w:jc w:val="center"/>
+            </w:pPr>
+            <w:r>
+              <w:rPr>
+                <w:rFonts w:ascii="Times New Roman" w:hAnsi="Times New Roman" w:eastAsia="宋体"/>
+                <w:b w:val="0"/>
+                <w:color w:val="000000"/>
+                <w:sz w:val="21"/>
+              </w:rPr>
+              <w:t>6</w:t>
+            </w:r>
+          </w:p>
+        </w:tc>
+        <w:tc>
+          <w:tcPr>
+            <w:tcW w:type="dxa" w:w="1814"/>
+            <w:vAlign w:val="center"/>
+          </w:tcPr>
+          <w:p>
+            <w:pPr>
+              <w:spacing w:after="0" w:line="280" w:lineRule="exact"/>
+              <w:ind w:firstLine="0"/>
+              <w:jc w:val="center"/>
+            </w:pPr>
+            <w:r>
+              <w:rPr>
+                <w:rFonts w:ascii="Times New Roman" w:hAnsi="Times New Roman" w:eastAsia="宋体"/>
+                <w:b w:val="0"/>
+                <w:color w:val="000000"/>
+                <w:sz w:val="21"/>
+              </w:rPr>
+              <w:t>-1,848</w:t>
+            </w:r>
+          </w:p>
+        </w:tc>
+        <w:tc>
+          <w:tcPr>
+            <w:tcW w:type="dxa" w:w="3685"/>
+            <w:vAlign w:val="center"/>
+          </w:tcPr>
+          <w:p>
+            <w:pPr>
+              <w:spacing w:after="0" w:line="280" w:lineRule="exact"/>
+              <w:ind w:firstLine="0"/>
+              <w:jc w:val="center"/>
+            </w:pPr>
+            <w:r>
+              <w:rPr>
+                <w:rFonts w:ascii="Times New Roman" w:hAnsi="Times New Roman" w:eastAsia="宋体"/>
+                <w:b w:val="0"/>
+                <w:color w:val="000000"/>
+                <w:sz w:val="21"/>
+              </w:rPr>
+              <w:t>3,415,104</w:t>
+            </w:r>
+          </w:p>
+        </w:tc>
+        <w:tc>
+          <w:tcPr>
+            <w:tcW w:type="dxa" w:w="1587"/>
+            <w:vAlign w:val="center"/>
+          </w:tcPr>
+          <w:p>
+            <w:pPr>
+              <w:spacing w:after="0" w:line="280" w:lineRule="exact"/>
+              <w:ind w:firstLine="0"/>
+              <w:jc w:val="center"/>
+            </w:pPr>
+            <w:r>
+              <w:rPr>
+                <w:rFonts w:ascii="Times New Roman" w:hAnsi="Times New Roman" w:eastAsia="宋体"/>
+                <w:b w:val="0"/>
+                <w:color w:val="000000"/>
+                <w:sz w:val="21"/>
+              </w:rPr>
+              <w:t>0</w:t>
+            </w:r>
+          </w:p>
+        </w:tc>
+      </w:tr>
+      <w:tr>
+        <w:trPr>
+          <w:cantSplit/>
+        </w:trPr>
+        <w:tc>
+          <w:tcPr>
+            <w:tcW w:type="dxa" w:w="850"/>
+            <w:vAlign w:val="center"/>
+          </w:tcPr>
+          <w:p>
+            <w:pPr>
+              <w:spacing w:after="0" w:line="280" w:lineRule="exact"/>
+              <w:ind w:firstLine="0"/>
+              <w:jc w:val="center"/>
+            </w:pPr>
+            <w:r>
+              <w:rPr>
+                <w:rFonts w:ascii="Times New Roman" w:hAnsi="Times New Roman" w:eastAsia="宋体"/>
+                <w:b w:val="0"/>
+                <w:color w:val="000000"/>
+                <w:sz w:val="21"/>
+              </w:rPr>
+              <w:t>8</w:t>
+            </w:r>
+          </w:p>
+        </w:tc>
+        <w:tc>
+          <w:tcPr>
+            <w:tcW w:type="dxa" w:w="1134"/>
+            <w:vAlign w:val="center"/>
+          </w:tcPr>
+          <w:p>
+            <w:pPr>
+              <w:spacing w:after="0" w:line="280" w:lineRule="exact"/>
+              <w:ind w:firstLine="0"/>
+              <w:jc w:val="center"/>
+            </w:pPr>
+            <w:r>
+              <w:rPr>
+                <w:rFonts w:ascii="Times New Roman" w:hAnsi="Times New Roman" w:eastAsia="宋体"/>
+                <w:b w:val="0"/>
+                <w:color w:val="000000"/>
+                <w:sz w:val="21"/>
+              </w:rPr>
+              <w:t>7</w:t>
+            </w:r>
+          </w:p>
+        </w:tc>
+        <w:tc>
+          <w:tcPr>
+            <w:tcW w:type="dxa" w:w="1814"/>
+            <w:vAlign w:val="center"/>
+          </w:tcPr>
+          <w:p>
+            <w:pPr>
+              <w:spacing w:after="0" w:line="280" w:lineRule="exact"/>
+              <w:ind w:firstLine="0"/>
+              <w:jc w:val="center"/>
+            </w:pPr>
+            <w:r>
+              <w:rPr>
+                <w:rFonts w:ascii="Times New Roman" w:hAnsi="Times New Roman" w:eastAsia="宋体"/>
+                <w:b w:val="0"/>
+                <w:color w:val="000000"/>
+                <w:sz w:val="21"/>
+              </w:rPr>
+              <w:t>1,848</w:t>
+            </w:r>
+          </w:p>
+        </w:tc>
+        <w:tc>
+          <w:tcPr>
+            <w:tcW w:type="dxa" w:w="3685"/>
+            <w:vAlign w:val="center"/>
+          </w:tcPr>
+          <w:p>
+            <w:pPr>
+              <w:spacing w:after="0" w:line="280" w:lineRule="exact"/>
+              <w:ind w:firstLine="0"/>
+              <w:jc w:val="center"/>
+            </w:pPr>
+            <w:r>
+              <w:rPr>
+                <w:rFonts w:ascii="Times New Roman" w:hAnsi="Times New Roman" w:eastAsia="宋体"/>
+                <w:b w:val="0"/>
+                <w:color w:val="000000"/>
+                <w:sz w:val="21"/>
+              </w:rPr>
+              <w:t>3,415,104</w:t>
+            </w:r>
+          </w:p>
+        </w:tc>
+        <w:tc>
+          <w:tcPr>
+            <w:tcW w:type="dxa" w:w="1587"/>
+            <w:vAlign w:val="center"/>
+          </w:tcPr>
+          <w:p>
+            <w:pPr>
+              <w:spacing w:after="0" w:line="280" w:lineRule="exact"/>
+              <w:ind w:firstLine="0"/>
+              <w:jc w:val="center"/>
+            </w:pPr>
+            <w:r>
+              <w:rPr>
+                <w:rFonts w:ascii="Times New Roman" w:hAnsi="Times New Roman" w:eastAsia="宋体"/>
+                <w:b w:val="0"/>
+                <w:color w:val="000000"/>
+                <w:sz w:val="21"/>
+              </w:rPr>
+              <w:t>0</w:t>
+            </w:r>
+          </w:p>
+        </w:tc>
+      </w:tr>
+      <w:tr>
+        <w:trPr>
+          <w:cantSplit/>
+        </w:trPr>
+        <w:tc>
+          <w:tcPr>
+            <w:tcW w:type="dxa" w:w="850"/>
+            <w:vAlign w:val="center"/>
+          </w:tcPr>
+          <w:p>
+            <w:pPr>
+              <w:spacing w:after="0" w:line="280" w:lineRule="exact"/>
+              <w:ind w:firstLine="0"/>
+              <w:jc w:val="center"/>
+            </w:pPr>
+            <w:r>
+              <w:rPr>
+                <w:rFonts w:ascii="Times New Roman" w:hAnsi="Times New Roman" w:eastAsia="宋体"/>
+                <w:b w:val="0"/>
+                <w:color w:val="000000"/>
+                <w:sz w:val="21"/>
+              </w:rPr>
+              <w:t>9</w:t>
+            </w:r>
+          </w:p>
+        </w:tc>
+        <w:tc>
+          <w:tcPr>
+            <w:tcW w:type="dxa" w:w="1134"/>
+            <w:vAlign w:val="center"/>
+          </w:tcPr>
+          <w:p>
+            <w:pPr>
+              <w:spacing w:after="0" w:line="280" w:lineRule="exact"/>
+              <w:ind w:firstLine="0"/>
+              <w:jc w:val="center"/>
+            </w:pPr>
+            <w:r>
+              <w:rPr>
+                <w:rFonts w:ascii="Times New Roman" w:hAnsi="Times New Roman" w:eastAsia="宋体"/>
+                <w:b w:val="0"/>
+                <w:color w:val="000000"/>
+                <w:sz w:val="21"/>
+              </w:rPr>
+              <w:t>8</w:t>
+            </w:r>
+          </w:p>
+        </w:tc>
+        <w:tc>
+          <w:tcPr>
+            <w:tcW w:type="dxa" w:w="1814"/>
+            <w:vAlign w:val="center"/>
+          </w:tcPr>
+          <w:p>
+            <w:pPr>
+              <w:spacing w:after="0" w:line="280" w:lineRule="exact"/>
+              <w:ind w:firstLine="0"/>
+              <w:jc w:val="center"/>
+            </w:pPr>
+            <w:r>
+              <w:rPr>
+                <w:rFonts w:ascii="Times New Roman" w:hAnsi="Times New Roman" w:eastAsia="宋体"/>
+                <w:b w:val="0"/>
+                <w:color w:val="000000"/>
+                <w:sz w:val="21"/>
+              </w:rPr>
+              <w:t>-56</w:t>
+            </w:r>
+          </w:p>
+        </w:tc>
+        <w:tc>
+          <w:tcPr>
+            <w:tcW w:type="dxa" w:w="3685"/>
+            <w:vAlign w:val="center"/>
+          </w:tcPr>
+          <w:p>
+            <w:pPr>
+              <w:spacing w:after="0" w:line="280" w:lineRule="exact"/>
+              <w:ind w:firstLine="0"/>
+              <w:jc w:val="center"/>
+            </w:pPr>
+            <w:r>
+              <w:rPr>
+                <w:rFonts w:ascii="Times New Roman" w:hAnsi="Times New Roman" w:eastAsia="宋体"/>
+                <w:b w:val="0"/>
+                <w:color w:val="000000"/>
+                <w:sz w:val="21"/>
+              </w:rPr>
+              <w:t>3,136</w:t>
+            </w:r>
+          </w:p>
+        </w:tc>
+        <w:tc>
+          <w:tcPr>
+            <w:tcW w:type="dxa" w:w="1587"/>
+            <w:vAlign w:val="center"/>
+          </w:tcPr>
+          <w:p>
+            <w:pPr>
+              <w:spacing w:after="0" w:line="280" w:lineRule="exact"/>
+              <w:ind w:firstLine="0"/>
+              <w:jc w:val="center"/>
+            </w:pPr>
+            <w:r>
+              <w:rPr>
+                <w:rFonts w:ascii="Times New Roman" w:hAnsi="Times New Roman" w:eastAsia="宋体"/>
+                <w:b w:val="0"/>
+                <w:color w:val="000000"/>
+                <w:sz w:val="21"/>
+              </w:rPr>
+              <w:t>0</w:t>
+            </w:r>
+          </w:p>
+        </w:tc>
+      </w:tr>
+      <w:tr>
+        <w:trPr>
+          <w:cantSplit/>
+        </w:trPr>
+        <w:tc>
+          <w:tcPr>
+            <w:tcW w:type="dxa" w:w="850"/>
+            <w:vAlign w:val="center"/>
+          </w:tcPr>
+          <w:p>
+            <w:pPr>
+              <w:spacing w:after="0" w:line="280" w:lineRule="exact"/>
+              <w:ind w:firstLine="0"/>
+              <w:jc w:val="center"/>
+            </w:pPr>
+            <w:r>
+              <w:rPr>
+                <w:rFonts w:ascii="Times New Roman" w:hAnsi="Times New Roman" w:eastAsia="宋体"/>
+                <w:b w:val="0"/>
+                <w:color w:val="000000"/>
+                <w:sz w:val="21"/>
+              </w:rPr>
+              <w:t>10</w:t>
+            </w:r>
+          </w:p>
+        </w:tc>
+        <w:tc>
+          <w:tcPr>
+            <w:tcW w:type="dxa" w:w="1134"/>
+            <w:vAlign w:val="center"/>
+          </w:tcPr>
+          <w:p>
+            <w:pPr>
+              <w:spacing w:after="0" w:line="280" w:lineRule="exact"/>
+              <w:ind w:firstLine="0"/>
+              <w:jc w:val="center"/>
+            </w:pPr>
+            <w:r>
+              <w:rPr>
+                <w:rFonts w:ascii="Times New Roman" w:hAnsi="Times New Roman" w:eastAsia="宋体"/>
+                <w:b w:val="0"/>
+                <w:color w:val="000000"/>
+                <w:sz w:val="21"/>
+              </w:rPr>
+              <w:t>9</w:t>
+            </w:r>
+          </w:p>
+        </w:tc>
+        <w:tc>
+          <w:tcPr>
+            <w:tcW w:type="dxa" w:w="1814"/>
+            <w:vAlign w:val="center"/>
+          </w:tcPr>
+          <w:p>
+            <w:pPr>
+              <w:spacing w:after="0" w:line="280" w:lineRule="exact"/>
+              <w:ind w:firstLine="0"/>
+              <w:jc w:val="center"/>
+            </w:pPr>
+            <w:r>
+              <w:rPr>
+                <w:rFonts w:ascii="Times New Roman" w:hAnsi="Times New Roman" w:eastAsia="宋体"/>
+                <w:b w:val="0"/>
+                <w:color w:val="000000"/>
+                <w:sz w:val="21"/>
+              </w:rPr>
+              <w:t>-56</w:t>
+            </w:r>
+          </w:p>
+        </w:tc>
+        <w:tc>
+          <w:tcPr>
+            <w:tcW w:type="dxa" w:w="3685"/>
+            <w:vAlign w:val="center"/>
+          </w:tcPr>
+          <w:p>
+            <w:pPr>
+              <w:spacing w:after="0" w:line="280" w:lineRule="exact"/>
+              <w:ind w:firstLine="0"/>
+              <w:jc w:val="center"/>
+            </w:pPr>
+            <w:r>
+              <w:rPr>
+                <w:rFonts w:ascii="Times New Roman" w:hAnsi="Times New Roman" w:eastAsia="宋体"/>
+                <w:b w:val="0"/>
+                <w:color w:val="000000"/>
+                <w:sz w:val="21"/>
+              </w:rPr>
+              <w:t>3,136</w:t>
+            </w:r>
+          </w:p>
+        </w:tc>
+        <w:tc>
+          <w:tcPr>
+            <w:tcW w:type="dxa" w:w="1587"/>
+            <w:vAlign w:val="center"/>
+          </w:tcPr>
+          <w:p>
+            <w:pPr>
+              <w:spacing w:after="0" w:line="280" w:lineRule="exact"/>
+              <w:ind w:firstLine="0"/>
+              <w:jc w:val="center"/>
+            </w:pPr>
+            <w:r>
+              <w:rPr>
+                <w:rFonts w:ascii="Times New Roman" w:hAnsi="Times New Roman" w:eastAsia="宋体"/>
+                <w:b w:val="0"/>
+                <w:color w:val="000000"/>
+                <w:sz w:val="21"/>
+              </w:rPr>
+              <w:t>0</w:t>
+            </w:r>
+          </w:p>
+        </w:tc>
+      </w:tr>
+      <w:tr>
+        <w:trPr>
+          <w:cantSplit/>
+        </w:trPr>
+        <w:tc>
+          <w:tcPr>
+            <w:tcW w:type="dxa" w:w="850"/>
+            <w:vAlign w:val="center"/>
+          </w:tcPr>
+          <w:p>
+            <w:pPr>
+              <w:spacing w:after="0" w:line="280" w:lineRule="exact"/>
+              <w:ind w:firstLine="0"/>
+              <w:jc w:val="center"/>
+            </w:pPr>
+            <w:r>
+              <w:rPr>
+                <w:rFonts w:ascii="Times New Roman" w:hAnsi="Times New Roman" w:eastAsia="宋体"/>
+                <w:b w:val="0"/>
+                <w:color w:val="000000"/>
+                <w:sz w:val="21"/>
+              </w:rPr>
+              <w:t>11</w:t>
+            </w:r>
+          </w:p>
+        </w:tc>
+        <w:tc>
+          <w:tcPr>
+            <w:tcW w:type="dxa" w:w="1134"/>
+            <w:vAlign w:val="center"/>
+          </w:tcPr>
+          <w:p>
+            <w:pPr>
+              <w:spacing w:after="0" w:line="280" w:lineRule="exact"/>
+              <w:ind w:firstLine="0"/>
+              <w:jc w:val="center"/>
+            </w:pPr>
+            <w:r>
+              <w:rPr>
+                <w:rFonts w:ascii="Times New Roman" w:hAnsi="Times New Roman" w:eastAsia="宋体"/>
+                <w:b w:val="0"/>
+                <w:color w:val="000000"/>
+                <w:sz w:val="21"/>
+              </w:rPr>
+              <w:t>10</w:t>
+            </w:r>
+          </w:p>
+        </w:tc>
+        <w:tc>
+          <w:tcPr>
+            <w:tcW w:type="dxa" w:w="1814"/>
+            <w:vAlign w:val="center"/>
+          </w:tcPr>
+          <w:p>
+            <w:pPr>
+              <w:spacing w:after="0" w:line="280" w:lineRule="exact"/>
+              <w:ind w:firstLine="0"/>
+              <w:jc w:val="center"/>
+            </w:pPr>
+            <w:r>
+              <w:rPr>
+                <w:rFonts w:ascii="Times New Roman" w:hAnsi="Times New Roman" w:eastAsia="宋体"/>
+                <w:b w:val="0"/>
+                <w:color w:val="000000"/>
+                <w:sz w:val="21"/>
+              </w:rPr>
+              <w:t>-57,288</w:t>
+            </w:r>
+          </w:p>
+        </w:tc>
+        <w:tc>
+          <w:tcPr>
+            <w:tcW w:type="dxa" w:w="3685"/>
+            <w:vAlign w:val="center"/>
+          </w:tcPr>
+          <w:p>
+            <w:pPr>
+              <w:spacing w:after="0" w:line="280" w:lineRule="exact"/>
+              <w:ind w:firstLine="0"/>
+              <w:jc w:val="center"/>
+            </w:pPr>
+            <w:r>
+              <w:rPr>
+                <w:rFonts w:ascii="Times New Roman" w:hAnsi="Times New Roman" w:eastAsia="宋体"/>
+                <w:b w:val="0"/>
+                <w:color w:val="000000"/>
+                <w:sz w:val="21"/>
+              </w:rPr>
+              <w:t>3,281,914,944</w:t>
+            </w:r>
+          </w:p>
+        </w:tc>
+        <w:tc>
+          <w:tcPr>
+            <w:tcW w:type="dxa" w:w="1587"/>
+            <w:vAlign w:val="center"/>
+          </w:tcPr>
+          <w:p>
+            <w:pPr>
+              <w:spacing w:after="0" w:line="280" w:lineRule="exact"/>
+              <w:ind w:firstLine="0"/>
+              <w:jc w:val="center"/>
+            </w:pPr>
+            <w:r>
+              <w:rPr>
+                <w:rFonts w:ascii="Times New Roman" w:hAnsi="Times New Roman" w:eastAsia="宋体"/>
+                <w:b w:val="0"/>
+                <w:color w:val="000000"/>
+                <w:sz w:val="21"/>
+              </w:rPr>
+              <w:t>1</w:t>
+            </w:r>
+          </w:p>
+        </w:tc>
+      </w:tr>
+      <w:tr>
+        <w:trPr>
+          <w:cantSplit/>
+        </w:trPr>
+        <w:tc>
+          <w:tcPr>
+            <w:tcW w:type="dxa" w:w="850"/>
+            <w:vAlign w:val="center"/>
+          </w:tcPr>
+          <w:p>
+            <w:pPr>
+              <w:spacing w:after="0" w:line="280" w:lineRule="exact"/>
+              <w:ind w:firstLine="0"/>
+              <w:jc w:val="center"/>
+            </w:pPr>
+            <w:r>
+              <w:rPr>
+                <w:rFonts w:ascii="Times New Roman" w:hAnsi="Times New Roman" w:eastAsia="宋体"/>
+                <w:b w:val="0"/>
+                <w:color w:val="000000"/>
+                <w:sz w:val="21"/>
+              </w:rPr>
+              <w:t>12</w:t>
+            </w:r>
+          </w:p>
+        </w:tc>
+        <w:tc>
+          <w:tcPr>
+            <w:tcW w:type="dxa" w:w="1134"/>
+            <w:vAlign w:val="center"/>
+          </w:tcPr>
+          <w:p>
+            <w:pPr>
+              <w:spacing w:after="0" w:line="280" w:lineRule="exact"/>
+              <w:ind w:firstLine="0"/>
+              <w:jc w:val="center"/>
+            </w:pPr>
+            <w:r>
+              <w:rPr>
+                <w:rFonts w:ascii="Times New Roman" w:hAnsi="Times New Roman" w:eastAsia="宋体"/>
+                <w:b w:val="0"/>
+                <w:color w:val="000000"/>
+                <w:sz w:val="21"/>
+              </w:rPr>
+              <w:t>10</w:t>
+            </w:r>
+          </w:p>
+        </w:tc>
+        <w:tc>
+          <w:tcPr>
+            <w:tcW w:type="dxa" w:w="1814"/>
+            <w:vAlign w:val="center"/>
+          </w:tcPr>
+          <w:p>
+            <w:pPr>
+              <w:spacing w:after="0" w:line="280" w:lineRule="exact"/>
+              <w:ind w:firstLine="0"/>
+              <w:jc w:val="center"/>
+            </w:pPr>
+            <w:r>
+              <w:rPr>
+                <w:rFonts w:ascii="Times New Roman" w:hAnsi="Times New Roman" w:eastAsia="宋体"/>
+                <w:b w:val="0"/>
+                <w:color w:val="000000"/>
+                <w:sz w:val="21"/>
+              </w:rPr>
+              <w:t>57,288</w:t>
+            </w:r>
+          </w:p>
+        </w:tc>
+        <w:tc>
+          <w:tcPr>
+            <w:tcW w:type="dxa" w:w="3685"/>
+            <w:vAlign w:val="center"/>
+          </w:tcPr>
+          <w:p>
+            <w:pPr>
+              <w:spacing w:after="0" w:line="280" w:lineRule="exact"/>
+              <w:ind w:firstLine="0"/>
+              <w:jc w:val="center"/>
+            </w:pPr>
+            <w:r>
+              <w:rPr>
+                <w:rFonts w:ascii="Times New Roman" w:hAnsi="Times New Roman" w:eastAsia="宋体"/>
+                <w:b w:val="0"/>
+                <w:color w:val="000000"/>
+                <w:sz w:val="21"/>
+              </w:rPr>
+              <w:t>3,281,914,944</w:t>
+            </w:r>
+          </w:p>
+        </w:tc>
+        <w:tc>
+          <w:tcPr>
+            <w:tcW w:type="dxa" w:w="1587"/>
+            <w:vAlign w:val="center"/>
+          </w:tcPr>
+          <w:p>
+            <w:pPr>
+              <w:spacing w:after="0" w:line="280" w:lineRule="exact"/>
+              <w:ind w:firstLine="0"/>
+              <w:jc w:val="center"/>
+            </w:pPr>
+            <w:r>
+              <w:rPr>
+                <w:rFonts w:ascii="Times New Roman" w:hAnsi="Times New Roman" w:eastAsia="宋体"/>
+                <w:b w:val="0"/>
+                <w:color w:val="000000"/>
+                <w:sz w:val="21"/>
+              </w:rPr>
+              <w:t>1</w:t>
+            </w:r>
+          </w:p>
+        </w:tc>
+      </w:tr>
+      <w:tr>
+        <w:trPr>
+          <w:cantSplit/>
+        </w:trPr>
+        <w:tc>
+          <w:tcPr>
+            <w:tcW w:type="dxa" w:w="850"/>
+            <w:vAlign w:val="center"/>
+          </w:tcPr>
+          <w:p>
+            <w:pPr>
+              <w:spacing w:after="0" w:line="280" w:lineRule="exact"/>
+              <w:ind w:firstLine="0"/>
+              <w:jc w:val="center"/>
+            </w:pPr>
+            <w:r>
+              <w:rPr>
+                <w:rFonts w:ascii="Times New Roman" w:hAnsi="Times New Roman" w:eastAsia="宋体"/>
+                <w:b w:val="0"/>
+                <w:color w:val="000000"/>
+                <w:sz w:val="21"/>
+              </w:rPr>
+              <w:t>13</w:t>
+            </w:r>
+          </w:p>
+        </w:tc>
+        <w:tc>
+          <w:tcPr>
+            <w:tcW w:type="dxa" w:w="1134"/>
+            <w:vAlign w:val="center"/>
+          </w:tcPr>
+          <w:p>
+            <w:pPr>
+              <w:spacing w:after="0" w:line="280" w:lineRule="exact"/>
+              <w:ind w:firstLine="0"/>
+              <w:jc w:val="center"/>
+            </w:pPr>
+            <w:r>
+              <w:rPr>
+                <w:rFonts w:ascii="Times New Roman" w:hAnsi="Times New Roman" w:eastAsia="宋体"/>
+                <w:b w:val="0"/>
+                <w:color w:val="000000"/>
+                <w:sz w:val="21"/>
+              </w:rPr>
+              <w:t>10</w:t>
+            </w:r>
+          </w:p>
+        </w:tc>
+        <w:tc>
+          <w:tcPr>
+            <w:tcW w:type="dxa" w:w="1814"/>
+            <w:vAlign w:val="center"/>
+          </w:tcPr>
+          <w:p>
+            <w:pPr>
+              <w:spacing w:after="0" w:line="280" w:lineRule="exact"/>
+              <w:ind w:firstLine="0"/>
+              <w:jc w:val="center"/>
+            </w:pPr>
+            <w:r>
+              <w:rPr>
+                <w:rFonts w:ascii="Times New Roman" w:hAnsi="Times New Roman" w:eastAsia="宋体"/>
+                <w:b w:val="0"/>
+                <w:color w:val="000000"/>
+                <w:sz w:val="21"/>
+              </w:rPr>
+              <w:t>-57,288</w:t>
+            </w:r>
+          </w:p>
+        </w:tc>
+        <w:tc>
+          <w:tcPr>
+            <w:tcW w:type="dxa" w:w="3685"/>
+            <w:vAlign w:val="center"/>
+          </w:tcPr>
+          <w:p>
+            <w:pPr>
+              <w:spacing w:after="0" w:line="280" w:lineRule="exact"/>
+              <w:ind w:firstLine="0"/>
+              <w:jc w:val="center"/>
+            </w:pPr>
+            <w:r>
+              <w:rPr>
+                <w:rFonts w:ascii="Times New Roman" w:hAnsi="Times New Roman" w:eastAsia="宋体"/>
+                <w:b w:val="0"/>
+                <w:color w:val="000000"/>
+                <w:sz w:val="21"/>
+              </w:rPr>
+              <w:t>3,281,914,944</w:t>
+            </w:r>
+          </w:p>
+        </w:tc>
+        <w:tc>
+          <w:tcPr>
+            <w:tcW w:type="dxa" w:w="1587"/>
+            <w:vAlign w:val="center"/>
+          </w:tcPr>
+          <w:p>
+            <w:pPr>
+              <w:spacing w:after="0" w:line="280" w:lineRule="exact"/>
+              <w:ind w:firstLine="0"/>
+              <w:jc w:val="center"/>
+            </w:pPr>
+            <w:r>
+              <w:rPr>
+                <w:rFonts w:ascii="Times New Roman" w:hAnsi="Times New Roman" w:eastAsia="宋体"/>
+                <w:b w:val="0"/>
+                <w:color w:val="000000"/>
+                <w:sz w:val="21"/>
+              </w:rPr>
+              <w:t>1</w:t>
+            </w:r>
+          </w:p>
+        </w:tc>
+      </w:tr>
+    </w:tbl>
+    <w:p>
+      <w:pPr>
+        <w:spacing w:after="80" w:line="360" w:lineRule="exact"/>
+        <w:ind w:firstLine="482"/>
+        <w:jc w:val="both"/>
+      </w:pPr>
+      <w:r>
+        <w:rPr>
+          <w:rFonts w:ascii="Times New Roman" w:hAnsi="Times New Roman" w:eastAsia="宋体"/>
+          <w:b w:val="0"/>
+          <w:color w:val="000000"/>
+          <w:sz w:val="24"/>
+        </w:rPr>
+        <w:t>全部窗口的 I 累加值均为 0。前 10 轮最大未对齐能量为 3 415 104，对齐后的三个窗口能量均为 3 281 914 944。因此，本次观测的最小对齐能量与最大未对齐能量之比为：</w:t>
+      </w:r>
+    </w:p>
+    <w:p>
+      <w:pPr>
+        <w:spacing w:after="100" w:line="380" w:lineRule="exact"/>
+        <w:jc w:val="center"/>
+      </w:pPr>
+      <m:oMath>
+        <m:r>
+          <m:t>R = </m:t>
+        </m:r>
+        <m:f>
+          <m:num>
+            <m:r>
+              <m:t>3 281 914 944</m:t>
+            </m:r>
+          </m:num>
+          <m:den>
+            <m:r>
+              <m:t>3 415 104</m:t>
+            </m:r>
+          </m:den>
+        </m:f>
+        <m:r>
+          <m:t> = 961 &gt; 100</m:t>
+        </m:r>
+      </m:oMath>
+    </w:p>
+    <w:p>
+      <w:pPr>
+        <w:spacing w:after="80" w:line="300" w:lineRule="exact"/>
+        <w:ind w:firstLine="0"/>
+        <w:jc w:val="both"/>
+      </w:pPr>
+      <w:r>
+        <w:rPr>
+          <w:rFonts w:ascii="Times New Roman" w:hAnsi="Times New Roman" w:eastAsia="宋体"/>
+          <w:b w:val="0"/>
+          <w:color w:val="000000"/>
+          <w:sz w:val="22"/>
+        </w:rPr>
+        <w:t>该结果满足能量高于未对齐值两个数量级的验收要求。NH 符号变化使 Q 的正负号改变，平方后能量保持一致。三个对齐窗口共核对 49 104 个有效样本，信号码与本地码无一处不同；累计输入 212 784 个有效样本。</w:t>
+      </w:r>
+    </w:p>
+    <w:p>
+      <w:pPr>
+        <w:spacing w:after="80" w:line="300" w:lineRule="exact"/>
+        <w:ind w:firstLine="0"/>
+        <w:jc w:val="both"/>
+      </w:pPr>
+      <w:r>
+        <w:rPr>
+          <w:rFonts w:ascii="Times New Roman" w:hAnsi="Times New Roman" w:eastAsia="宋体"/>
+          <w:b w:val="0"/>
+          <w:color w:val="000000"/>
+          <w:sz w:val="22"/>
+        </w:rPr>
+        <w:t>补充验证中，含输入停顿的单星用例得到相同的逐轮结果；错误卫星码 PRN 5、固定错误位置 0 和零输入均未触发捕获。原并行捕获引擎也已接入同一教师源，检出半码片位置 20、多普勒字 0；位置 20 与本节的 10 个整码片表示同一相位偏移。该并行用例仍采用原有幅度峰均比判据，统计量不与本节 E 混用。</w:t>
+      </w:r>
+    </w:p>
+    <w:p>
+      <w:pPr>
+        <w:pStyle w:val="21"/>
+        <w:pageBreakBefore/>
+      </w:pPr>
+      <w:r>
+        <w:t>10.4 波形观测与结果分析</w:t>
+      </w:r>
+    </w:p>
+    <w:p>
+      <w:pPr>
+        <w:spacing w:after="80" w:line="300" w:lineRule="exact"/>
+        <w:ind w:firstLine="0"/>
+        <w:jc w:val="both"/>
+      </w:pPr>
+      <w:r>
+        <w:rPr>
+          <w:rFonts w:ascii="Times New Roman" w:hAnsi="Times New Roman" w:eastAsia="宋体"/>
+          <w:b w:val="0"/>
+          <w:color w:val="000000"/>
+          <w:sz w:val="22"/>
+        </w:rPr>
+        <w:t>图 4 的数据来自 RTL 每轮结束时导出的记录。图 5 从同一实验生成的 ModelSim 波形文件读取码线，再绘制为对比图。</w:t>
+      </w:r>
+    </w:p>
+    <w:p>
+      <w:pPr>
+        <w:keepNext/>
+        <w:spacing w:line="240" w:lineRule="auto" w:after="60"/>
+        <w:jc w:val="center"/>
+      </w:pPr>
+      <w:r>
+        <w:drawing>
+          <wp:inline xmlns:a="http://schemas.openxmlformats.org/drawingml/2006/main" xmlns:pic="http://schemas.openxmlformats.org/drawingml/2006/picture">
+            <wp:extent cx="5652000" cy="2669000"/>
+            <wp:docPr id="4" name="Picture 4"/>
+            <wp:cNvGraphicFramePr>
+              <a:graphicFrameLocks noChangeAspect="1"/>
+            </wp:cNvGraphicFramePr>
+            <a:graphic>
+              <a:graphicData uri="http://schemas.openxmlformats.org/drawingml/2006/picture">
+                <pic:pic>
+                  <pic:nvPicPr>
+                    <pic:cNvPr id="0" name="捕获_单星能量对比.png"/>
+                    <pic:cNvPicPr/>
+                  </pic:nvPicPr>
+                  <pic:blipFill>
+                    <a:blip r:embed="rId15"/>
+                    <a:stretch>
+                      <a:fillRect/>
+                    </a:stretch>
+                  </pic:blipFill>
+                  <pic:spPr>
+                    <a:xfrm>
+                      <a:off x="0" y="0"/>
+                      <a:ext cx="5652000" cy="2669000"/>
+                    </a:xfrm>
+                    <a:prstGeom prst="rect"/>
+                  </pic:spPr>
+                </pic:pic>
+              </a:graphicData>
+            </a:graphic>
+          </wp:inline>
+        </w:drawing>
+      </w:r>
+    </w:p>
+    <w:p>
+      <w:pPr>
+        <w:spacing w:after="80" w:line="300" w:lineRule="exact"/>
+        <w:ind w:firstLine="0"/>
+        <w:jc w:val="center"/>
+      </w:pPr>
+      <w:r>
+        <w:rPr>
+          <w:rFonts w:ascii="Times New Roman" w:hAnsi="Times New Roman" w:eastAsia="宋体"/>
+          <w:b w:val="0"/>
+          <w:color w:val="000000"/>
+          <w:sz w:val="19"/>
+        </w:rPr>
+        <w:t>图 4　单星捕获的逐轮相关能量及 961 倍能量比</w:t>
+      </w:r>
+    </w:p>
+    <w:p>
+      <w:pPr>
+        <w:keepNext/>
+        <w:spacing w:line="240" w:lineRule="auto" w:after="60"/>
+        <w:jc w:val="center"/>
+      </w:pPr>
+      <w:r>
+        <w:drawing>
+          <wp:inline xmlns:a="http://schemas.openxmlformats.org/drawingml/2006/main" xmlns:pic="http://schemas.openxmlformats.org/drawingml/2006/picture">
+            <wp:extent cx="5652000" cy="3100750"/>
+            <wp:docPr id="5" name="Picture 5"/>
+            <wp:cNvGraphicFramePr>
+              <a:graphicFrameLocks noChangeAspect="1"/>
+            </wp:cNvGraphicFramePr>
+            <a:graphic>
+              <a:graphicData uri="http://schemas.openxmlformats.org/drawingml/2006/picture">
+                <pic:pic>
+                  <pic:nvPicPr>
+                    <pic:cNvPr id="0" name="捕获_单星码对齐.png"/>
+                    <pic:cNvPicPr/>
+                  </pic:nvPicPr>
+                  <pic:blipFill>
+                    <a:blip r:embed="rId16"/>
+                    <a:stretch>
+                      <a:fillRect/>
+                    </a:stretch>
+                  </pic:blipFill>
+                  <pic:spPr>
+                    <a:xfrm>
+                      <a:off x="0" y="0"/>
+                      <a:ext cx="5652000" cy="3100750"/>
+                    </a:xfrm>
+                    <a:prstGeom prst="rect"/>
+                  </pic:spPr>
+                </pic:pic>
+              </a:graphicData>
+            </a:graphic>
+          </wp:inline>
+        </w:drawing>
+      </w:r>
+    </w:p>
+    <w:p>
+      <w:pPr>
+        <w:spacing w:after="80" w:line="300" w:lineRule="exact"/>
+        <w:ind w:firstLine="0"/>
+        <w:jc w:val="center"/>
+      </w:pPr>
+      <w:r>
+        <w:rPr>
+          <w:rFonts w:ascii="Times New Roman" w:hAnsi="Times New Roman" w:eastAsia="宋体"/>
+          <w:b w:val="0"/>
+          <w:color w:val="000000"/>
+          <w:sz w:val="19"/>
+        </w:rPr>
+        <w:t>图 5　未对齐与捕获成功后的信号码和本地码</w:t>
+      </w:r>
+    </w:p>
+    <w:p>
+      <w:pPr>
+        <w:spacing w:after="80" w:line="300" w:lineRule="exact"/>
+        <w:ind w:firstLine="0"/>
+        <w:jc w:val="both"/>
+      </w:pPr>
+      <w:r>
+        <w:rPr>
+          <w:rFonts w:ascii="Times New Roman" w:hAnsi="Times New Roman" w:eastAsia="宋体"/>
+          <w:b w:val="0"/>
+          <w:color w:val="000000"/>
+          <w:sz w:val="22"/>
+        </w:rPr>
+        <w:t>未对齐时，两串码的正负贡献大部分抵消，累加结果较小；对齐后，大量贡献同向累加，形成明显的能量峰。图中的能量是相关累加值平方后的结果，并非直接对原始输入样本求能量。</w:t>
+      </w:r>
+    </w:p>
+    <w:p>
+      <w:pPr>
+        <w:pStyle w:val="21"/>
+        <w:pageBreakBefore/>
+      </w:pPr>
+      <w:r>
+        <w:t>10.5 验证范围与实现文件</w:t>
+      </w:r>
+    </w:p>
+    <w:p>
+      <w:pPr>
+        <w:spacing w:after="80" w:line="360" w:lineRule="exact"/>
+        <w:ind w:firstLine="482"/>
+        <w:jc w:val="both"/>
+      </w:pPr>
+      <w:r>
+        <w:rPr>
+          <w:rFonts w:ascii="Times New Roman" w:hAnsi="Times New Roman" w:eastAsia="宋体"/>
+          <w:b w:val="0"/>
+          <w:color w:val="000000"/>
+          <w:sz w:val="24"/>
+        </w:rPr>
+        <w:t>本实验验证了固定 PRN、零多普勒、无噪声条件下的码位置搜索、完整窗口累加和能量判决。961 倍是本次对齐窗口相对于实际搜索的前 10 个未对齐窗口的比值。它不能直接推广为全部码位置、有噪声或存在频率误差时的性能保证；能量门限也只针对本次幅度与积分配置。完整接收机的验证范围仍按第 8 节所列条件判断。</w:t>
+      </w:r>
+    </w:p>
+    <w:p>
+      <w:pPr>
+        <w:spacing w:after="80" w:line="300" w:lineRule="exact"/>
+        <w:ind w:firstLine="0"/>
+        <w:jc w:val="both"/>
+      </w:pPr>
+      <w:r>
+        <w:rPr>
+          <w:rFonts w:ascii="Times New Roman" w:hAnsi="Times New Roman" w:eastAsia="宋体"/>
+          <w:b w:val="0"/>
+          <w:color w:val="000000"/>
+          <w:sz w:val="22"/>
+        </w:rPr>
+        <w:t>判据必须区分单位。本节采用 I²+Q²，能量比为 961；若只比较 |I|+|Q|，本场景的幅度比为 31，不能用该幅度比替代能量验收结果。接收机通过能量门限决定是否成功，测试台中的位置 10 仅用于检查结果。</w:t>
+      </w:r>
+    </w:p>
+    <w:tbl>
+      <w:tblPr>
+        <w:tblW w:type="auto" w:w="0"/>
+        <w:jc w:val="center"/>
+        <w:tblLayout w:type="fixed"/>
+        <w:tblLook w:firstColumn="1" w:firstRow="1" w:lastColumn="0" w:lastRow="0" w:noHBand="0" w:noVBand="1" w:val="04A0"/>
+        <w:tblBorders>
+          <w:top w:val="single" w:sz="4" w:color="D9D9D9"/>
+          <w:left w:val="single" w:sz="4" w:color="D9D9D9"/>
+          <w:bottom w:val="single" w:sz="4" w:color="D9D9D9"/>
+          <w:right w:val="single" w:sz="4" w:color="D9D9D9"/>
+          <w:insideH w:val="single" w:sz="4" w:color="D9D9D9"/>
+          <w:insideV w:val="single" w:sz="4" w:color="D9D9D9"/>
+        </w:tblBorders>
+        <w:tblCellMar>
+          <w:top w:w="75" w:type="dxa"/>
+          <w:bottom w:w="75" w:type="dxa"/>
+          <w:left w:w="100" w:type="dxa"/>
+          <w:right w:w="100" w:type="dxa"/>
+        </w:tblCellMar>
+      </w:tblPr>
+      <w:tblGrid>
+        <w:gridCol w:w="2041"/>
+        <w:gridCol w:w="7030"/>
+      </w:tblGrid>
+      <w:tr>
+        <w:trPr>
+          <w:cantSplit/>
+          <w:tblHeader/>
+        </w:trPr>
+        <w:tc>
+          <w:tcPr>
+            <w:tcW w:type="dxa" w:w="2041"/>
+            <w:vAlign w:val="center"/>
+            <w:shd w:fill="F2F2F2"/>
+          </w:tcPr>
+          <w:p>
+            <w:pPr>
+              <w:spacing w:after="0" w:line="280" w:lineRule="exact"/>
+              <w:ind w:firstLine="0"/>
+              <w:jc w:val="center"/>
+            </w:pPr>
+            <w:r>
+              <w:rPr>
+                <w:rFonts w:ascii="Times New Roman" w:hAnsi="Times New Roman" w:eastAsia="宋体"/>
+                <w:b/>
+                <w:color w:val="000000"/>
+                <w:sz w:val="21"/>
+              </w:rPr>
+              <w:t>用途</w:t>
+            </w:r>
+          </w:p>
+        </w:tc>
+        <w:tc>
+          <w:tcPr>
+            <w:tcW w:type="dxa" w:w="7030"/>
+            <w:vAlign w:val="center"/>
+            <w:shd w:fill="F2F2F2"/>
+          </w:tcPr>
+          <w:p>
+            <w:pPr>
+              <w:spacing w:after="0" w:line="280" w:lineRule="exact"/>
+              <w:ind w:firstLine="0"/>
+              <w:jc w:val="center"/>
+            </w:pPr>
+            <w:r>
+              <w:rPr>
+                <w:rFonts w:ascii="Times New Roman" w:hAnsi="Times New Roman" w:eastAsia="宋体"/>
+                <w:b/>
+                <w:color w:val="000000"/>
+                <w:sz w:val="21"/>
+              </w:rPr>
+              <w:t>仓库内文件位置</w:t>
+            </w:r>
+          </w:p>
+        </w:tc>
+      </w:tr>
+      <w:tr>
+        <w:trPr>
+          <w:cantSplit/>
+        </w:trPr>
+        <w:tc>
+          <w:tcPr>
+            <w:tcW w:type="dxa" w:w="2041"/>
+            <w:vAlign w:val="center"/>
+          </w:tcPr>
+          <w:p>
+            <w:pPr>
+              <w:spacing w:after="0" w:line="280" w:lineRule="exact"/>
+              <w:ind w:firstLine="0"/>
+              <w:jc w:val="left"/>
+            </w:pPr>
+            <w:r>
+              <w:rPr>
+                <w:rFonts w:ascii="Times New Roman" w:hAnsi="Times New Roman" w:eastAsia="宋体"/>
+                <w:b w:val="0"/>
+                <w:color w:val="000000"/>
+                <w:sz w:val="21"/>
+              </w:rPr>
+              <w:t>原完整捕获与后续链路</w:t>
+            </w:r>
+          </w:p>
+        </w:tc>
+        <w:tc>
+          <w:tcPr>
+            <w:tcW w:type="dxa" w:w="7030"/>
+            <w:vAlign w:val="center"/>
+          </w:tcPr>
+          <w:p>
+            <w:pPr>
+              <w:spacing w:after="0" w:line="280" w:lineRule="exact"/>
+              <w:ind w:firstLine="0"/>
+              <w:jc w:val="left"/>
+            </w:pPr>
+            <w:r>
+              <w:rPr>
+                <w:rFonts w:ascii="Times New Roman" w:hAnsi="Times New Roman" w:eastAsia="宋体"/>
+                <w:b w:val="0"/>
+                <w:color w:val="000000"/>
+                <w:sz w:val="21"/>
+              </w:rPr>
+              <w:t>rtl/acq/acquisition.sv；rtl/ctrl/channel_manager.sv；rtl/track/tracking_channel.sv</w:t>
+            </w:r>
+          </w:p>
+        </w:tc>
+      </w:tr>
+      <w:tr>
+        <w:trPr>
+          <w:cantSplit/>
+        </w:trPr>
+        <w:tc>
+          <w:tcPr>
+            <w:tcW w:type="dxa" w:w="2041"/>
+            <w:vAlign w:val="center"/>
+          </w:tcPr>
+          <w:p>
+            <w:pPr>
+              <w:spacing w:after="0" w:line="280" w:lineRule="exact"/>
+              <w:ind w:firstLine="0"/>
+              <w:jc w:val="left"/>
+            </w:pPr>
+            <w:r>
+              <w:rPr>
+                <w:rFonts w:ascii="Times New Roman" w:hAnsi="Times New Roman" w:eastAsia="宋体"/>
+                <w:b w:val="0"/>
+                <w:color w:val="000000"/>
+                <w:sz w:val="21"/>
+              </w:rPr>
+              <w:t>新增单星捕获电路</w:t>
+            </w:r>
+          </w:p>
+        </w:tc>
+        <w:tc>
+          <w:tcPr>
+            <w:tcW w:type="dxa" w:w="7030"/>
+            <w:vAlign w:val="center"/>
+          </w:tcPr>
+          <w:p>
+            <w:pPr>
+              <w:spacing w:after="0" w:line="280" w:lineRule="exact"/>
+              <w:ind w:firstLine="0"/>
+              <w:jc w:val="left"/>
+            </w:pPr>
+            <w:r>
+              <w:rPr>
+                <w:rFonts w:ascii="Times New Roman" w:hAnsi="Times New Roman" w:eastAsia="宋体"/>
+                <w:b w:val="0"/>
+                <w:color w:val="000000"/>
+                <w:sz w:val="21"/>
+              </w:rPr>
+              <w:t>rtl/acq/bdi_sliding_correlator.sv</w:t>
+            </w:r>
+          </w:p>
+        </w:tc>
+      </w:tr>
+      <w:tr>
+        <w:trPr>
+          <w:cantSplit/>
+        </w:trPr>
+        <w:tc>
+          <w:tcPr>
+            <w:tcW w:type="dxa" w:w="2041"/>
+            <w:vAlign w:val="center"/>
+          </w:tcPr>
+          <w:p>
+            <w:pPr>
+              <w:spacing w:after="0" w:line="280" w:lineRule="exact"/>
+              <w:ind w:firstLine="0"/>
+              <w:jc w:val="left"/>
+            </w:pPr>
+            <w:r>
+              <w:rPr>
+                <w:rFonts w:ascii="Times New Roman" w:hAnsi="Times New Roman" w:eastAsia="宋体"/>
+                <w:b w:val="0"/>
+                <w:color w:val="000000"/>
+                <w:sz w:val="21"/>
+              </w:rPr>
+              <w:t>共用码发生器</w:t>
+            </w:r>
+          </w:p>
+        </w:tc>
+        <w:tc>
+          <w:tcPr>
+            <w:tcW w:type="dxa" w:w="7030"/>
+            <w:vAlign w:val="center"/>
+          </w:tcPr>
+          <w:p>
+            <w:pPr>
+              <w:spacing w:after="0" w:line="280" w:lineRule="exact"/>
+              <w:ind w:firstLine="0"/>
+              <w:jc w:val="left"/>
+            </w:pPr>
+            <w:r>
+              <w:rPr>
+                <w:rFonts w:ascii="Times New Roman" w:hAnsi="Times New Roman" w:eastAsia="宋体"/>
+                <w:b w:val="0"/>
+                <w:color w:val="000000"/>
+                <w:sz w:val="21"/>
+              </w:rPr>
+              <w:t>rtl/common/prn_code_gen.sv</w:t>
+            </w:r>
+          </w:p>
+        </w:tc>
+      </w:tr>
+      <w:tr>
+        <w:trPr>
+          <w:cantSplit/>
+        </w:trPr>
+        <w:tc>
+          <w:tcPr>
+            <w:tcW w:type="dxa" w:w="2041"/>
+            <w:vAlign w:val="center"/>
+          </w:tcPr>
+          <w:p>
+            <w:pPr>
+              <w:spacing w:after="0" w:line="280" w:lineRule="exact"/>
+              <w:ind w:firstLine="0"/>
+              <w:jc w:val="left"/>
+            </w:pPr>
+            <w:r>
+              <w:rPr>
+                <w:rFonts w:ascii="Times New Roman" w:hAnsi="Times New Roman" w:eastAsia="宋体"/>
+                <w:b w:val="0"/>
+                <w:color w:val="000000"/>
+                <w:sz w:val="21"/>
+              </w:rPr>
+              <w:t>单星连接和检查</w:t>
+            </w:r>
+          </w:p>
+        </w:tc>
+        <w:tc>
+          <w:tcPr>
+            <w:tcW w:type="dxa" w:w="7030"/>
+            <w:vAlign w:val="center"/>
+          </w:tcPr>
+          <w:p>
+            <w:pPr>
+              <w:spacing w:after="0" w:line="280" w:lineRule="exact"/>
+              <w:ind w:firstLine="0"/>
+              <w:jc w:val="left"/>
+            </w:pPr>
+            <w:r>
+              <w:rPr>
+                <w:rFonts w:ascii="Times New Roman" w:hAnsi="Times New Roman" w:eastAsia="宋体"/>
+                <w:b w:val="0"/>
+                <w:color w:val="000000"/>
+                <w:sz w:val="21"/>
+              </w:rPr>
+              <w:t>单星捕获验收/tb_single_sat_capture.sv</w:t>
+            </w:r>
+          </w:p>
+        </w:tc>
+      </w:tr>
+      <w:tr>
+        <w:trPr>
+          <w:cantSplit/>
+        </w:trPr>
+        <w:tc>
+          <w:tcPr>
+            <w:tcW w:type="dxa" w:w="2041"/>
+            <w:vAlign w:val="center"/>
+          </w:tcPr>
+          <w:p>
+            <w:pPr>
+              <w:spacing w:after="0" w:line="280" w:lineRule="exact"/>
+              <w:ind w:firstLine="0"/>
+              <w:jc w:val="left"/>
+            </w:pPr>
+            <w:r>
+              <w:rPr>
+                <w:rFonts w:ascii="Times New Roman" w:hAnsi="Times New Roman" w:eastAsia="宋体"/>
+                <w:b w:val="0"/>
+                <w:color w:val="000000"/>
+                <w:sz w:val="21"/>
+              </w:rPr>
+              <w:t>仿真与波形入口</w:t>
+            </w:r>
+          </w:p>
+        </w:tc>
+        <w:tc>
+          <w:tcPr>
+            <w:tcW w:type="dxa" w:w="7030"/>
+            <w:vAlign w:val="center"/>
+          </w:tcPr>
+          <w:p>
+            <w:pPr>
+              <w:spacing w:after="0" w:line="280" w:lineRule="exact"/>
+              <w:ind w:firstLine="0"/>
+              <w:jc w:val="left"/>
+            </w:pPr>
+            <w:r>
+              <w:rPr>
+                <w:rFonts w:ascii="Times New Roman" w:hAnsi="Times New Roman" w:eastAsia="宋体"/>
+                <w:b w:val="0"/>
+                <w:color w:val="000000"/>
+                <w:sz w:val="21"/>
+              </w:rPr>
+              <w:t>单星捕获验收/run_demo.ps1；单星捕获验收/wave.do</w:t>
+            </w:r>
+          </w:p>
+        </w:tc>
+      </w:tr>
+      <w:tr>
+        <w:trPr>
+          <w:cantSplit/>
+        </w:trPr>
+        <w:tc>
+          <w:tcPr>
+            <w:tcW w:type="dxa" w:w="2041"/>
+            <w:vAlign w:val="center"/>
+          </w:tcPr>
+          <w:p>
+            <w:pPr>
+              <w:spacing w:after="0" w:line="280" w:lineRule="exact"/>
+              <w:ind w:firstLine="0"/>
+              <w:jc w:val="left"/>
+            </w:pPr>
+            <w:r>
+              <w:rPr>
+                <w:rFonts w:ascii="Times New Roman" w:hAnsi="Times New Roman" w:eastAsia="宋体"/>
+                <w:b w:val="0"/>
+                <w:color w:val="000000"/>
+                <w:sz w:val="21"/>
+              </w:rPr>
+              <w:t>本次验证记录</w:t>
+            </w:r>
+          </w:p>
+        </w:tc>
+        <w:tc>
+          <w:tcPr>
+            <w:tcW w:type="dxa" w:w="7030"/>
+            <w:vAlign w:val="center"/>
+          </w:tcPr>
+          <w:p>
+            <w:pPr>
+              <w:spacing w:after="0" w:line="280" w:lineRule="exact"/>
+              <w:ind w:firstLine="0"/>
+              <w:jc w:val="left"/>
+            </w:pPr>
+            <w:r>
+              <w:rPr>
+                <w:rFonts w:ascii="Times New Roman" w:hAnsi="Times New Roman" w:eastAsia="宋体"/>
+                <w:b w:val="0"/>
+                <w:color w:val="000000"/>
+                <w:sz w:val="21"/>
+              </w:rPr>
+              <w:t>验证资料_20261019/capture.csv；result.json；teacher_capture_validation.json</w:t>
+            </w:r>
+          </w:p>
+        </w:tc>
+      </w:tr>
+    </w:tbl>
+    <w:p>
+      <w:pPr>
+        <w:pStyle w:val="21"/>
+      </w:pPr>
+      <w:r>
+        <w:t>10.6 实验复现与验收观测</w:t>
+      </w:r>
+    </w:p>
+    <w:p>
+      <w:pPr>
+        <w:spacing w:after="80" w:line="360" w:lineRule="exact"/>
+        <w:ind w:firstLine="482"/>
+        <w:jc w:val="both"/>
+      </w:pPr>
+      <w:r>
+        <w:rPr>
+          <w:rFonts w:ascii="Times New Roman" w:hAnsi="Times New Roman" w:eastAsia="宋体"/>
+          <w:b w:val="0"/>
+          <w:color w:val="000000"/>
+          <w:sz w:val="24"/>
+        </w:rPr>
+        <w:t>在项目根目录的“单星捕获验收”文件夹中双击“打开验收波形.cmd”。脚本重新编译并仿真，自动核对逐轮位置、能量和捕获结果后，打开实际记录的 ModelSim 波形。每次运行使用独立目录，旧波形可以继续保留。</w:t>
+      </w:r>
+    </w:p>
+    <w:tbl>
+      <w:tblPr>
+        <w:tblW w:type="auto" w:w="0"/>
+        <w:jc w:val="center"/>
+        <w:tblLayout w:type="fixed"/>
+        <w:tblLook w:firstColumn="1" w:firstRow="1" w:lastColumn="0" w:lastRow="0" w:noHBand="0" w:noVBand="1" w:val="04A0"/>
+        <w:tblBorders>
+          <w:top w:val="single" w:sz="4" w:color="D9D9D9"/>
+          <w:left w:val="single" w:sz="4" w:color="D9D9D9"/>
+          <w:bottom w:val="single" w:sz="4" w:color="D9D9D9"/>
+          <w:right w:val="single" w:sz="4" w:color="D9D9D9"/>
+          <w:insideH w:val="single" w:sz="4" w:color="D9D9D9"/>
+          <w:insideV w:val="single" w:sz="4" w:color="D9D9D9"/>
+        </w:tblBorders>
+        <w:tblCellMar>
+          <w:top w:w="75" w:type="dxa"/>
+          <w:bottom w:w="75" w:type="dxa"/>
+          <w:left w:w="100" w:type="dxa"/>
+          <w:right w:w="100" w:type="dxa"/>
+        </w:tblCellMar>
+      </w:tblPr>
+      <w:tblGrid>
+        <w:gridCol w:w="3288"/>
+        <w:gridCol w:w="5783"/>
+      </w:tblGrid>
+      <w:tr>
+        <w:trPr>
+          <w:cantSplit/>
+          <w:tblHeader/>
+        </w:trPr>
+        <w:tc>
+          <w:tcPr>
+            <w:tcW w:type="dxa" w:w="3288"/>
+            <w:vAlign w:val="center"/>
+            <w:shd w:fill="F2F2F2"/>
+          </w:tcPr>
+          <w:p>
+            <w:pPr>
+              <w:spacing w:after="0" w:line="280" w:lineRule="exact"/>
+              <w:ind w:firstLine="0"/>
+              <w:jc w:val="center"/>
+            </w:pPr>
+            <w:r>
+              <w:rPr>
+                <w:rFonts w:ascii="Times New Roman" w:hAnsi="Times New Roman" w:eastAsia="宋体"/>
+                <w:b/>
+                <w:color w:val="000000"/>
+                <w:sz w:val="21"/>
+              </w:rPr>
+              <w:t>波形信号</w:t>
+            </w:r>
+          </w:p>
+        </w:tc>
+        <w:tc>
+          <w:tcPr>
+            <w:tcW w:type="dxa" w:w="5783"/>
+            <w:vAlign w:val="center"/>
+            <w:shd w:fill="F2F2F2"/>
+          </w:tcPr>
+          <w:p>
+            <w:pPr>
+              <w:spacing w:after="0" w:line="280" w:lineRule="exact"/>
+              <w:ind w:firstLine="0"/>
+              <w:jc w:val="center"/>
+            </w:pPr>
+            <w:r>
+              <w:rPr>
+                <w:rFonts w:ascii="Times New Roman" w:hAnsi="Times New Roman" w:eastAsia="宋体"/>
+                <w:b/>
+                <w:color w:val="000000"/>
+                <w:sz w:val="21"/>
+              </w:rPr>
+              <w:t>观测内容</w:t>
+            </w:r>
+          </w:p>
+        </w:tc>
+      </w:tr>
+      <w:tr>
+        <w:trPr>
+          <w:cantSplit/>
+        </w:trPr>
+        <w:tc>
+          <w:tcPr>
+            <w:tcW w:type="dxa" w:w="3288"/>
+            <w:vAlign w:val="center"/>
+          </w:tcPr>
+          <w:p>
+            <w:pPr>
+              <w:spacing w:after="0" w:line="280" w:lineRule="exact"/>
+              <w:ind w:firstLine="0"/>
+              <w:jc w:val="left"/>
+            </w:pPr>
+            <w:r>
+              <w:rPr>
+                <w:rFonts w:ascii="Times New Roman" w:hAnsi="Times New Roman" w:eastAsia="宋体"/>
+                <w:b w:val="0"/>
+                <w:color w:val="000000"/>
+                <w:sz w:val="21"/>
+              </w:rPr>
+              <w:t>signal_code 与 local_code</w:t>
+            </w:r>
+          </w:p>
+        </w:tc>
+        <w:tc>
+          <w:tcPr>
+            <w:tcW w:type="dxa" w:w="5783"/>
+            <w:vAlign w:val="center"/>
+          </w:tcPr>
+          <w:p>
+            <w:pPr>
+              <w:spacing w:after="0" w:line="280" w:lineRule="exact"/>
+              <w:ind w:firstLine="0"/>
+              <w:jc w:val="left"/>
+            </w:pPr>
+            <w:r>
+              <w:rPr>
+                <w:rFonts w:ascii="Times New Roman" w:hAnsi="Times New Roman" w:eastAsia="宋体"/>
+                <w:b w:val="0"/>
+                <w:color w:val="000000"/>
+                <w:sz w:val="21"/>
+              </w:rPr>
+              <w:t>分别为信号码和本地码；成功后两条码线重合</w:t>
+            </w:r>
+          </w:p>
+        </w:tc>
+      </w:tr>
+      <w:tr>
+        <w:trPr>
+          <w:cantSplit/>
+        </w:trPr>
+        <w:tc>
+          <w:tcPr>
+            <w:tcW w:type="dxa" w:w="3288"/>
+            <w:vAlign w:val="center"/>
+          </w:tcPr>
+          <w:p>
+            <w:pPr>
+              <w:spacing w:after="0" w:line="280" w:lineRule="exact"/>
+              <w:ind w:firstLine="0"/>
+              <w:jc w:val="left"/>
+            </w:pPr>
+            <w:r>
+              <w:rPr>
+                <w:rFonts w:ascii="Times New Roman" w:hAnsi="Times New Roman" w:eastAsia="宋体"/>
+                <w:b w:val="0"/>
+                <w:color w:val="000000"/>
+                <w:sz w:val="21"/>
+              </w:rPr>
+              <w:t>result_phase 与 energy</w:t>
+            </w:r>
+          </w:p>
+        </w:tc>
+        <w:tc>
+          <w:tcPr>
+            <w:tcW w:type="dxa" w:w="5783"/>
+            <w:vAlign w:val="center"/>
+          </w:tcPr>
+          <w:p>
+            <w:pPr>
+              <w:spacing w:after="0" w:line="280" w:lineRule="exact"/>
+              <w:ind w:firstLine="0"/>
+              <w:jc w:val="left"/>
+            </w:pPr>
+            <w:r>
+              <w:rPr>
+                <w:rFonts w:ascii="Times New Roman" w:hAnsi="Times New Roman" w:eastAsia="宋体"/>
+                <w:b w:val="0"/>
+                <w:color w:val="000000"/>
+                <w:sz w:val="21"/>
+              </w:rPr>
+              <w:t>刚完成窗口的位置与能量；第 11 轮为位置 10 和高能量</w:t>
+            </w:r>
+          </w:p>
+        </w:tc>
+      </w:tr>
+      <w:tr>
+        <w:trPr>
+          <w:cantSplit/>
+        </w:trPr>
+        <w:tc>
+          <w:tcPr>
+            <w:tcW w:type="dxa" w:w="3288"/>
+            <w:vAlign w:val="center"/>
+          </w:tcPr>
+          <w:p>
+            <w:pPr>
+              <w:spacing w:after="0" w:line="280" w:lineRule="exact"/>
+              <w:ind w:firstLine="0"/>
+              <w:jc w:val="left"/>
+            </w:pPr>
+            <w:r>
+              <w:rPr>
+                <w:rFonts w:ascii="Times New Roman" w:hAnsi="Times New Roman" w:eastAsia="宋体"/>
+                <w:b w:val="0"/>
+                <w:color w:val="000000"/>
+                <w:sz w:val="21"/>
+              </w:rPr>
+              <w:t>dump 与 capture</w:t>
+            </w:r>
+          </w:p>
+        </w:tc>
+        <w:tc>
+          <w:tcPr>
+            <w:tcW w:type="dxa" w:w="5783"/>
+            <w:vAlign w:val="center"/>
+          </w:tcPr>
+          <w:p>
+            <w:pPr>
+              <w:spacing w:after="0" w:line="280" w:lineRule="exact"/>
+              <w:ind w:firstLine="0"/>
+              <w:jc w:val="left"/>
+            </w:pPr>
+            <w:r>
+              <w:rPr>
+                <w:rFonts w:ascii="Times New Roman" w:hAnsi="Times New Roman" w:eastAsia="宋体"/>
+                <w:b w:val="0"/>
+                <w:color w:val="000000"/>
+                <w:sz w:val="21"/>
+              </w:rPr>
+              <w:t>每轮结束的提示与捕获标志；成功后 capture 保持为 1</w:t>
+            </w:r>
+          </w:p>
+        </w:tc>
+      </w:tr>
+    </w:tbl>
+    <w:p>
+      <w:pPr>
+        <w:spacing w:after="80" w:line="300" w:lineRule="exact"/>
+        <w:ind w:firstLine="0"/>
+        <w:jc w:val="both"/>
+      </w:pPr>
+      <w:r>
+        <w:rPr>
+          <w:rFonts w:ascii="Times New Roman" w:hAnsi="Times New Roman" w:eastAsia="宋体"/>
+          <w:b w:val="0"/>
+          <w:color w:val="000000"/>
+          <w:sz w:val="22"/>
+        </w:rPr>
+        <w:t>总览显示 0～14 ms；可分别放大 5.400 ms 和 11.400 ms 附近，比较未对齐和已对齐的码线。能量值反映最近一个已完成窗口，本地码则随正在处理的窗口推进。详细操作、关键代码定位和讲稿见“验收文件索引与讲解提纲.md”；原完整工程讲解见“原完整项目讲解提纲_20261013.md”。</w:t>
+      </w:r>
+    </w:p>
+    <w:p>
+      <w:pPr>
+        <w:spacing w:after="80" w:line="300" w:lineRule="exact"/>
+        <w:ind w:firstLine="0"/>
+        <w:jc w:val="both"/>
+      </w:pPr>
+      <w:r>
+        <w:rPr>
+          <w:rFonts w:ascii="Times New Roman" w:hAnsi="Times New Roman" w:eastAsia="宋体"/>
+          <w:b w:val="0"/>
+          <w:color w:val="000000"/>
+          <w:sz w:val="19"/>
+        </w:rPr>
+        <w:t>命令行复现：powershell.exe -NoProfile -ExecutionPolicy Bypass -File .\单星捕获验收\run_demo.ps1。只仿真、不打开窗口时追加 -NoGui。</w:t>
+      </w:r>
+    </w:p>
+    <w:p>
+      <w:pPr>
+        <w:pStyle w:val="1"/>
+        <w:pageBreakBefore/>
+      </w:pPr>
+      <w:r>
         <w:t>附录 新版输入契约与联调验证</w:t>
       </w:r>
     </w:p>
@@ -4229,7 +7346,7 @@
           <w:color w:val="000000"/>
           <w:sz w:val="19"/>
         </w:rPr>
-        <w:t>复现入口：scripts/run_teacher_receiver.py --max-bytes 65540 --stall-period 7；独立采样顺序测试台：tb/integration/tb_teacher_player_order.sv；证据目录：验证资料_20261013。完整可执行命令见“验收文件索引与讲解提纲”。</w:t>
+        <w:t>复现入口：scripts/run_teacher_receiver.py --max-bytes 65540 --stall-period 7；独立采样顺序测试台：tb/integration/tb_teacher_player_order.sv；证据目录：验证资料_20261013。完整工程的操作命令见“原完整项目讲解提纲_20261013.md”；新增单星演示见“验收文件索引与讲解提纲.md”。</w:t>
       </w:r>
     </w:p>
     <w:sectPr>

</xml_diff>